<commit_message>
Add second progress-sync package and local-retrieval v1
- outputs/formal_comm_v0/: figure-forward MD progress sync in the first-sync
  style, four web-native figure screenshots, generator script, HTML preview.
- docs/local_retrieval_tasks_v1.md: split local-retrieval tasks into Tier 1
  (online-doable, locked) and Tier 2 (needs local collaborator).
- source_docs/current: first and second boss-facing sync PDFs; extended
  research modules renumbered R12-R14 in the plan doc to match the module menu.

Co-Authored-By: Claude Opus 4.8 (1M context) <noreply@anthropic.com>
</commit_message>
<xml_diff>
--- a/source_docs/current/复归后冲绳民间组织 _ NGO 分类与议题网络一期研究方案 (3).docx
+++ b/source_docs/current/复归后冲绳民间组织 _ NGO 分类与议题网络一期研究方案 (3).docx
@@ -6084,7 +6084,7 @@
       </w:pPr>
       <w:r>
         <w:object>
-          <v:shape id="_x0000_i1040" style="width:414pt;height:147pt;mso-width-percent:0;mso-height-percent:0;mso-width-percent:0;mso-height-percent:0" type="#_x0000_t75" o:ole="">
+          <v:shape id="_x0000_i1040" style="width:414pt;height:197pt;mso-width-percent:0;mso-height-percent:0;mso-width-percent:0;mso-height-percent:0" type="#_x0000_t75" o:ole="">
             <v:imagedata r:id="rId37" o:title=""/>
           </v:shape>
           <o:OLEObject DrawAspect="Icon" ObjectID="_1718471234" ProgID="Excel.Sheet.12" ShapeID="_x0000_i1040" Type="Embed" r:id="rId36"/>
@@ -6183,7 +6183,7 @@
           <w:b w:val="true"/>
           <w:sz w:val="28"/>
         </w:rPr>
-        <w:t>R11. 媒体可见度与“谁在发声”</w:t>
+        <w:t>R12. 媒体可见度与“谁在发声”</w:t>
       </w:r>
       <w:bookmarkEnd w:id="31"/>
     </w:p>
@@ -6231,7 +6231,7 @@
           <w:b w:val="true"/>
           <w:sz w:val="28"/>
         </w:rPr>
-        <w:t>R12. 人物—组织互锁与关键经纪人</w:t>
+        <w:t>R13. 人物—组织互锁与关键经纪人</w:t>
       </w:r>
       <w:bookmarkEnd w:id="32"/>
     </w:p>
@@ -6279,7 +6279,7 @@
           <w:b w:val="true"/>
           <w:sz w:val="28"/>
         </w:rPr>
-        <w:t>R13. 组织谱系与长期演变</w:t>
+        <w:t>R14. 组织谱系与长期演变</w:t>
       </w:r>
       <w:bookmarkEnd w:id="33"/>
     </w:p>
@@ -7521,1607 +7521,1607 @@
 
 <file path=word/numbering.xml><?xml version="1.0" encoding="utf-8"?>
 <w:numbering xmlns:w="http://schemas.openxmlformats.org/wordprocessingml/2006/main">
-  <w:abstractNum w:abstractNumId="2747693">
-    <w:lvl>
-      <w:numFmt w:val="bullet"/>
-      <w:suff w:val="tab"/>
-      <w:lvlText w:val="•"/>
-      <w:rPr>
-        <w:color w:val="3370ff"/>
-      </w:rPr>
-    </w:lvl>
-  </w:abstractNum>
-  <w:abstractNum w:abstractNumId="2747694">
-    <w:lvl>
-      <w:numFmt w:val="bullet"/>
-      <w:suff w:val="tab"/>
-      <w:lvlText w:val="•"/>
-      <w:rPr>
-        <w:color w:val="3370ff"/>
-      </w:rPr>
-    </w:lvl>
-  </w:abstractNum>
-  <w:abstractNum w:abstractNumId="2747695">
-    <w:lvl>
-      <w:numFmt w:val="bullet"/>
-      <w:suff w:val="tab"/>
-      <w:lvlText w:val="•"/>
-      <w:rPr>
-        <w:color w:val="3370ff"/>
-      </w:rPr>
-    </w:lvl>
-  </w:abstractNum>
-  <w:abstractNum w:abstractNumId="2747696">
-    <w:lvl>
-      <w:numFmt w:val="bullet"/>
-      <w:suff w:val="tab"/>
-      <w:lvlText w:val="•"/>
-      <w:rPr>
-        <w:color w:val="3370ff"/>
-      </w:rPr>
-    </w:lvl>
-  </w:abstractNum>
-  <w:abstractNum w:abstractNumId="2747697">
-    <w:lvl>
-      <w:numFmt w:val="bullet"/>
-      <w:suff w:val="tab"/>
-      <w:lvlText w:val="•"/>
-      <w:rPr>
-        <w:color w:val="3370ff"/>
-      </w:rPr>
-    </w:lvl>
-  </w:abstractNum>
-  <w:abstractNum w:abstractNumId="2747698">
-    <w:lvl>
-      <w:numFmt w:val="bullet"/>
-      <w:suff w:val="tab"/>
-      <w:lvlText w:val="•"/>
-      <w:rPr>
-        <w:color w:val="3370ff"/>
-      </w:rPr>
-    </w:lvl>
-  </w:abstractNum>
-  <w:abstractNum w:abstractNumId="2747699">
-    <w:lvl>
-      <w:numFmt w:val="bullet"/>
-      <w:suff w:val="tab"/>
-      <w:lvlText w:val="•"/>
-      <w:rPr>
-        <w:color w:val="3370ff"/>
-      </w:rPr>
-    </w:lvl>
-  </w:abstractNum>
-  <w:abstractNum w:abstractNumId="2747700">
-    <w:lvl>
-      <w:numFmt w:val="bullet"/>
-      <w:suff w:val="tab"/>
-      <w:lvlText w:val="•"/>
-      <w:rPr>
-        <w:color w:val="3370ff"/>
-      </w:rPr>
-    </w:lvl>
-  </w:abstractNum>
-  <w:abstractNum w:abstractNumId="2747701">
-    <w:lvl>
-      <w:numFmt w:val="bullet"/>
-      <w:suff w:val="tab"/>
-      <w:lvlText w:val="•"/>
-      <w:rPr>
-        <w:color w:val="3370ff"/>
-      </w:rPr>
-    </w:lvl>
-  </w:abstractNum>
-  <w:abstractNum w:abstractNumId="2747702">
-    <w:lvl>
-      <w:numFmt w:val="bullet"/>
-      <w:suff w:val="tab"/>
-      <w:lvlText w:val="•"/>
-      <w:rPr>
-        <w:color w:val="3370ff"/>
-      </w:rPr>
-    </w:lvl>
-  </w:abstractNum>
-  <w:abstractNum w:abstractNumId="2747703">
-    <w:lvl>
-      <w:numFmt w:val="bullet"/>
-      <w:suff w:val="tab"/>
-      <w:lvlText w:val="•"/>
-      <w:rPr>
-        <w:color w:val="3370ff"/>
-      </w:rPr>
-    </w:lvl>
-  </w:abstractNum>
-  <w:abstractNum w:abstractNumId="2747704">
-    <w:lvl>
-      <w:numFmt w:val="bullet"/>
-      <w:suff w:val="tab"/>
-      <w:lvlText w:val="•"/>
-      <w:rPr>
-        <w:color w:val="3370ff"/>
-      </w:rPr>
-    </w:lvl>
-  </w:abstractNum>
-  <w:abstractNum w:abstractNumId="2747705">
-    <w:lvl>
-      <w:numFmt w:val="bullet"/>
-      <w:suff w:val="tab"/>
-      <w:lvlText w:val="•"/>
-      <w:rPr>
-        <w:color w:val="3370ff"/>
-      </w:rPr>
-    </w:lvl>
-  </w:abstractNum>
-  <w:abstractNum w:abstractNumId="2747706">
-    <w:lvl>
-      <w:numFmt w:val="bullet"/>
-      <w:suff w:val="tab"/>
-      <w:lvlText w:val="•"/>
-      <w:rPr>
-        <w:color w:val="3370ff"/>
-      </w:rPr>
-    </w:lvl>
-  </w:abstractNum>
-  <w:abstractNum w:abstractNumId="2747707">
-    <w:lvl>
-      <w:numFmt w:val="bullet"/>
-      <w:suff w:val="tab"/>
-      <w:lvlText w:val="•"/>
-      <w:rPr>
-        <w:color w:val="3370ff"/>
-      </w:rPr>
-    </w:lvl>
-  </w:abstractNum>
-  <w:abstractNum w:abstractNumId="2747708">
-    <w:lvl>
-      <w:numFmt w:val="bullet"/>
-      <w:suff w:val="tab"/>
-      <w:lvlText w:val="•"/>
-      <w:rPr>
-        <w:color w:val="3370ff"/>
-      </w:rPr>
-    </w:lvl>
-  </w:abstractNum>
-  <w:abstractNum w:abstractNumId="2747709">
-    <w:lvl>
-      <w:numFmt w:val="bullet"/>
-      <w:suff w:val="tab"/>
-      <w:lvlText w:val="•"/>
-      <w:rPr>
-        <w:color w:val="3370ff"/>
-      </w:rPr>
-    </w:lvl>
-  </w:abstractNum>
-  <w:abstractNum w:abstractNumId="2747710">
-    <w:lvl>
-      <w:numFmt w:val="bullet"/>
-      <w:suff w:val="tab"/>
-      <w:lvlText w:val="•"/>
-      <w:rPr>
-        <w:color w:val="3370ff"/>
-      </w:rPr>
-    </w:lvl>
-  </w:abstractNum>
-  <w:abstractNum w:abstractNumId="2747711">
-    <w:lvl>
-      <w:numFmt w:val="bullet"/>
-      <w:suff w:val="tab"/>
-      <w:lvlText w:val="•"/>
-      <w:rPr>
-        <w:color w:val="3370ff"/>
-      </w:rPr>
-    </w:lvl>
-  </w:abstractNum>
-  <w:abstractNum w:abstractNumId="2747712">
-    <w:lvl>
-      <w:numFmt w:val="bullet"/>
-      <w:suff w:val="tab"/>
-      <w:lvlText w:val="•"/>
-      <w:rPr>
-        <w:color w:val="3370ff"/>
-      </w:rPr>
-    </w:lvl>
-  </w:abstractNum>
-  <w:abstractNum w:abstractNumId="2747713">
-    <w:lvl>
-      <w:numFmt w:val="bullet"/>
-      <w:suff w:val="tab"/>
-      <w:lvlText w:val="•"/>
-      <w:rPr>
-        <w:color w:val="3370ff"/>
-      </w:rPr>
-    </w:lvl>
-  </w:abstractNum>
-  <w:abstractNum w:abstractNumId="2747714">
-    <w:lvl>
-      <w:numFmt w:val="bullet"/>
-      <w:suff w:val="tab"/>
-      <w:lvlText w:val="•"/>
-      <w:rPr>
-        <w:color w:val="3370ff"/>
-      </w:rPr>
-    </w:lvl>
-  </w:abstractNum>
-  <w:abstractNum w:abstractNumId="2747715">
-    <w:lvl>
-      <w:numFmt w:val="bullet"/>
-      <w:suff w:val="tab"/>
-      <w:lvlText w:val="•"/>
-      <w:rPr>
-        <w:color w:val="3370ff"/>
-      </w:rPr>
-    </w:lvl>
-  </w:abstractNum>
-  <w:abstractNum w:abstractNumId="2747716">
-    <w:lvl>
-      <w:numFmt w:val="bullet"/>
-      <w:suff w:val="tab"/>
-      <w:lvlText w:val="•"/>
-      <w:rPr>
-        <w:color w:val="3370ff"/>
-      </w:rPr>
-    </w:lvl>
-  </w:abstractNum>
-  <w:abstractNum w:abstractNumId="2747717">
-    <w:lvl>
-      <w:numFmt w:val="bullet"/>
-      <w:suff w:val="tab"/>
-      <w:lvlText w:val="•"/>
-      <w:rPr>
-        <w:color w:val="3370ff"/>
-      </w:rPr>
-    </w:lvl>
-  </w:abstractNum>
-  <w:abstractNum w:abstractNumId="2747718">
-    <w:lvl>
-      <w:numFmt w:val="bullet"/>
-      <w:suff w:val="tab"/>
-      <w:lvlText w:val="•"/>
-      <w:rPr>
-        <w:color w:val="3370ff"/>
-      </w:rPr>
-    </w:lvl>
-  </w:abstractNum>
-  <w:abstractNum w:abstractNumId="2747719">
-    <w:lvl>
-      <w:numFmt w:val="bullet"/>
-      <w:suff w:val="tab"/>
-      <w:lvlText w:val="•"/>
-      <w:rPr>
-        <w:color w:val="3370ff"/>
-      </w:rPr>
-    </w:lvl>
-  </w:abstractNum>
-  <w:abstractNum w:abstractNumId="2747720">
-    <w:lvl>
-      <w:numFmt w:val="bullet"/>
-      <w:suff w:val="tab"/>
-      <w:lvlText w:val="•"/>
-      <w:rPr>
-        <w:color w:val="3370ff"/>
-      </w:rPr>
-    </w:lvl>
-  </w:abstractNum>
-  <w:abstractNum w:abstractNumId="2747721">
-    <w:lvl>
-      <w:numFmt w:val="bullet"/>
-      <w:suff w:val="tab"/>
-      <w:lvlText w:val="•"/>
-      <w:rPr>
-        <w:color w:val="3370ff"/>
-      </w:rPr>
-    </w:lvl>
-  </w:abstractNum>
-  <w:abstractNum w:abstractNumId="2747722">
-    <w:lvl>
-      <w:numFmt w:val="bullet"/>
-      <w:suff w:val="tab"/>
-      <w:lvlText w:val="•"/>
-      <w:rPr>
-        <w:color w:val="3370ff"/>
-      </w:rPr>
-    </w:lvl>
-  </w:abstractNum>
-  <w:abstractNum w:abstractNumId="2747723">
-    <w:lvl>
-      <w:numFmt w:val="bullet"/>
-      <w:suff w:val="tab"/>
-      <w:lvlText w:val="•"/>
-      <w:rPr>
-        <w:color w:val="3370ff"/>
-      </w:rPr>
-    </w:lvl>
-  </w:abstractNum>
-  <w:abstractNum w:abstractNumId="2747724">
-    <w:lvl>
-      <w:numFmt w:val="bullet"/>
-      <w:suff w:val="tab"/>
-      <w:lvlText w:val="•"/>
-      <w:rPr>
-        <w:color w:val="3370ff"/>
-      </w:rPr>
-    </w:lvl>
-  </w:abstractNum>
-  <w:abstractNum w:abstractNumId="2747725">
-    <w:lvl>
-      <w:numFmt w:val="bullet"/>
-      <w:suff w:val="tab"/>
-      <w:lvlText w:val="•"/>
-      <w:rPr>
-        <w:color w:val="3370ff"/>
-      </w:rPr>
-    </w:lvl>
-  </w:abstractNum>
-  <w:abstractNum w:abstractNumId="2747726">
-    <w:lvl>
-      <w:numFmt w:val="bullet"/>
-      <w:suff w:val="tab"/>
-      <w:lvlText w:val="•"/>
-      <w:rPr>
-        <w:color w:val="3370ff"/>
-      </w:rPr>
-    </w:lvl>
-  </w:abstractNum>
-  <w:abstractNum w:abstractNumId="2747727">
-    <w:lvl>
-      <w:numFmt w:val="bullet"/>
-      <w:suff w:val="tab"/>
-      <w:lvlText w:val="•"/>
-      <w:rPr>
-        <w:color w:val="3370ff"/>
-      </w:rPr>
-    </w:lvl>
-  </w:abstractNum>
-  <w:abstractNum w:abstractNumId="2747728">
-    <w:lvl>
-      <w:numFmt w:val="bullet"/>
-      <w:suff w:val="tab"/>
-      <w:lvlText w:val="•"/>
-      <w:rPr>
-        <w:color w:val="3370ff"/>
-      </w:rPr>
-    </w:lvl>
-  </w:abstractNum>
-  <w:abstractNum w:abstractNumId="2747729">
-    <w:lvl>
-      <w:numFmt w:val="bullet"/>
-      <w:suff w:val="tab"/>
-      <w:lvlText w:val="•"/>
-      <w:rPr>
-        <w:color w:val="3370ff"/>
-      </w:rPr>
-    </w:lvl>
-  </w:abstractNum>
-  <w:abstractNum w:abstractNumId="2747730">
-    <w:lvl>
-      <w:numFmt w:val="bullet"/>
-      <w:suff w:val="tab"/>
-      <w:lvlText w:val="•"/>
-      <w:rPr>
-        <w:color w:val="3370ff"/>
-      </w:rPr>
-    </w:lvl>
-  </w:abstractNum>
-  <w:abstractNum w:abstractNumId="2747731">
-    <w:lvl>
-      <w:numFmt w:val="bullet"/>
-      <w:suff w:val="tab"/>
-      <w:lvlText w:val="•"/>
-      <w:rPr>
-        <w:color w:val="3370ff"/>
-      </w:rPr>
-    </w:lvl>
-  </w:abstractNum>
-  <w:abstractNum w:abstractNumId="2747732">
-    <w:lvl>
-      <w:numFmt w:val="bullet"/>
-      <w:suff w:val="tab"/>
-      <w:lvlText w:val="•"/>
-      <w:rPr>
-        <w:color w:val="3370ff"/>
-      </w:rPr>
-    </w:lvl>
-  </w:abstractNum>
-  <w:abstractNum w:abstractNumId="2747733">
-    <w:lvl>
-      <w:numFmt w:val="bullet"/>
-      <w:suff w:val="tab"/>
-      <w:lvlText w:val="•"/>
-      <w:rPr>
-        <w:color w:val="3370ff"/>
-      </w:rPr>
-    </w:lvl>
-  </w:abstractNum>
-  <w:abstractNum w:abstractNumId="2747734">
-    <w:lvl>
-      <w:numFmt w:val="bullet"/>
-      <w:suff w:val="tab"/>
-      <w:lvlText w:val="•"/>
-      <w:rPr>
-        <w:color w:val="3370ff"/>
-      </w:rPr>
-    </w:lvl>
-  </w:abstractNum>
-  <w:abstractNum w:abstractNumId="2747735">
-    <w:lvl>
-      <w:numFmt w:val="bullet"/>
-      <w:suff w:val="tab"/>
-      <w:lvlText w:val="•"/>
-      <w:rPr>
-        <w:color w:val="3370ff"/>
-      </w:rPr>
-    </w:lvl>
-  </w:abstractNum>
-  <w:abstractNum w:abstractNumId="2747736">
-    <w:lvl>
-      <w:numFmt w:val="bullet"/>
-      <w:suff w:val="tab"/>
-      <w:lvlText w:val="•"/>
-      <w:rPr>
-        <w:color w:val="3370ff"/>
-      </w:rPr>
-    </w:lvl>
-  </w:abstractNum>
-  <w:abstractNum w:abstractNumId="2747737">
-    <w:lvl>
-      <w:numFmt w:val="bullet"/>
-      <w:suff w:val="tab"/>
-      <w:lvlText w:val="•"/>
-      <w:rPr>
-        <w:color w:val="3370ff"/>
-      </w:rPr>
-    </w:lvl>
-  </w:abstractNum>
-  <w:abstractNum w:abstractNumId="2747738">
-    <w:lvl>
-      <w:numFmt w:val="bullet"/>
-      <w:suff w:val="tab"/>
-      <w:lvlText w:val="•"/>
-      <w:rPr>
-        <w:color w:val="3370ff"/>
-      </w:rPr>
-    </w:lvl>
-  </w:abstractNum>
-  <w:abstractNum w:abstractNumId="2747739">
-    <w:lvl>
-      <w:numFmt w:val="bullet"/>
-      <w:suff w:val="tab"/>
-      <w:lvlText w:val="•"/>
-      <w:rPr>
-        <w:color w:val="3370ff"/>
-      </w:rPr>
-    </w:lvl>
-  </w:abstractNum>
-  <w:abstractNum w:abstractNumId="2747740">
-    <w:lvl>
-      <w:numFmt w:val="bullet"/>
-      <w:suff w:val="tab"/>
-      <w:lvlText w:val="•"/>
-      <w:rPr>
-        <w:color w:val="3370ff"/>
-      </w:rPr>
-    </w:lvl>
-  </w:abstractNum>
-  <w:abstractNum w:abstractNumId="2747741">
-    <w:lvl>
-      <w:numFmt w:val="bullet"/>
-      <w:suff w:val="tab"/>
-      <w:lvlText w:val="•"/>
-      <w:rPr>
-        <w:color w:val="3370ff"/>
-      </w:rPr>
-    </w:lvl>
-  </w:abstractNum>
-  <w:abstractNum w:abstractNumId="2747742">
-    <w:lvl>
-      <w:numFmt w:val="bullet"/>
-      <w:suff w:val="tab"/>
-      <w:lvlText w:val="•"/>
-      <w:rPr>
-        <w:color w:val="3370ff"/>
-      </w:rPr>
-    </w:lvl>
-  </w:abstractNum>
-  <w:abstractNum w:abstractNumId="2747743">
-    <w:lvl>
-      <w:numFmt w:val="bullet"/>
-      <w:suff w:val="tab"/>
-      <w:lvlText w:val="•"/>
-      <w:rPr>
-        <w:color w:val="3370ff"/>
-      </w:rPr>
-    </w:lvl>
-  </w:abstractNum>
-  <w:abstractNum w:abstractNumId="2747744">
-    <w:lvl>
-      <w:numFmt w:val="bullet"/>
-      <w:suff w:val="tab"/>
-      <w:lvlText w:val="•"/>
-      <w:rPr>
-        <w:color w:val="3370ff"/>
-      </w:rPr>
-    </w:lvl>
-  </w:abstractNum>
-  <w:abstractNum w:abstractNumId="2747745">
-    <w:lvl>
-      <w:numFmt w:val="bullet"/>
-      <w:suff w:val="tab"/>
-      <w:lvlText w:val="•"/>
-      <w:rPr>
-        <w:color w:val="3370ff"/>
-      </w:rPr>
-    </w:lvl>
-  </w:abstractNum>
-  <w:abstractNum w:abstractNumId="2747746">
-    <w:lvl>
-      <w:numFmt w:val="bullet"/>
-      <w:suff w:val="tab"/>
-      <w:lvlText w:val="•"/>
-      <w:rPr>
-        <w:color w:val="3370ff"/>
-      </w:rPr>
-    </w:lvl>
-  </w:abstractNum>
-  <w:abstractNum w:abstractNumId="2747747">
-    <w:lvl>
-      <w:numFmt w:val="bullet"/>
-      <w:suff w:val="tab"/>
-      <w:lvlText w:val="•"/>
-      <w:rPr>
-        <w:color w:val="3370ff"/>
-      </w:rPr>
-    </w:lvl>
-  </w:abstractNum>
-  <w:abstractNum w:abstractNumId="2747748">
-    <w:lvl>
-      <w:numFmt w:val="bullet"/>
-      <w:suff w:val="tab"/>
-      <w:lvlText w:val="•"/>
-      <w:rPr>
-        <w:color w:val="3370ff"/>
-      </w:rPr>
-    </w:lvl>
-  </w:abstractNum>
-  <w:abstractNum w:abstractNumId="2747749">
-    <w:lvl>
-      <w:numFmt w:val="bullet"/>
-      <w:suff w:val="tab"/>
-      <w:lvlText w:val="•"/>
-      <w:rPr>
-        <w:color w:val="3370ff"/>
-      </w:rPr>
-    </w:lvl>
-  </w:abstractNum>
-  <w:abstractNum w:abstractNumId="2747750">
-    <w:lvl>
-      <w:numFmt w:val="bullet"/>
-      <w:suff w:val="tab"/>
-      <w:lvlText w:val="•"/>
-      <w:rPr>
-        <w:color w:val="3370ff"/>
-      </w:rPr>
-    </w:lvl>
-  </w:abstractNum>
-  <w:abstractNum w:abstractNumId="2747751">
-    <w:lvl>
-      <w:numFmt w:val="bullet"/>
-      <w:suff w:val="tab"/>
-      <w:lvlText w:val="•"/>
-      <w:rPr>
-        <w:color w:val="3370ff"/>
-      </w:rPr>
-    </w:lvl>
-  </w:abstractNum>
-  <w:abstractNum w:abstractNumId="2747752">
-    <w:lvl>
-      <w:numFmt w:val="bullet"/>
-      <w:suff w:val="tab"/>
-      <w:lvlText w:val="•"/>
-      <w:rPr>
-        <w:color w:val="3370ff"/>
-      </w:rPr>
-    </w:lvl>
-  </w:abstractNum>
-  <w:abstractNum w:abstractNumId="2747753">
-    <w:lvl>
-      <w:numFmt w:val="bullet"/>
-      <w:suff w:val="tab"/>
-      <w:lvlText w:val="•"/>
-      <w:rPr>
-        <w:color w:val="3370ff"/>
-      </w:rPr>
-    </w:lvl>
-  </w:abstractNum>
-  <w:abstractNum w:abstractNumId="2747754">
-    <w:lvl>
-      <w:numFmt w:val="bullet"/>
-      <w:suff w:val="tab"/>
-      <w:lvlText w:val="•"/>
-      <w:rPr>
-        <w:color w:val="3370ff"/>
-      </w:rPr>
-    </w:lvl>
-  </w:abstractNum>
-  <w:abstractNum w:abstractNumId="2747755">
-    <w:lvl>
-      <w:numFmt w:val="bullet"/>
-      <w:suff w:val="tab"/>
-      <w:lvlText w:val="•"/>
-      <w:rPr>
-        <w:color w:val="3370ff"/>
-      </w:rPr>
-    </w:lvl>
-  </w:abstractNum>
-  <w:abstractNum w:abstractNumId="2747756">
-    <w:lvl>
-      <w:numFmt w:val="bullet"/>
-      <w:suff w:val="tab"/>
-      <w:lvlText w:val="•"/>
-      <w:rPr>
-        <w:color w:val="3370ff"/>
-      </w:rPr>
-    </w:lvl>
-  </w:abstractNum>
-  <w:abstractNum w:abstractNumId="2747757">
-    <w:lvl>
-      <w:numFmt w:val="bullet"/>
-      <w:suff w:val="tab"/>
-      <w:lvlText w:val="•"/>
-      <w:rPr>
-        <w:color w:val="3370ff"/>
-      </w:rPr>
-    </w:lvl>
-  </w:abstractNum>
-  <w:abstractNum w:abstractNumId="2747758">
-    <w:lvl>
-      <w:numFmt w:val="bullet"/>
-      <w:suff w:val="tab"/>
-      <w:lvlText w:val="•"/>
-      <w:rPr>
-        <w:color w:val="3370ff"/>
-      </w:rPr>
-    </w:lvl>
-  </w:abstractNum>
-  <w:abstractNum w:abstractNumId="2747759">
-    <w:lvl>
-      <w:numFmt w:val="bullet"/>
-      <w:suff w:val="tab"/>
-      <w:lvlText w:val="•"/>
-      <w:rPr>
-        <w:color w:val="3370ff"/>
-      </w:rPr>
-    </w:lvl>
-  </w:abstractNum>
-  <w:abstractNum w:abstractNumId="2747760">
-    <w:lvl>
-      <w:numFmt w:val="bullet"/>
-      <w:suff w:val="tab"/>
-      <w:lvlText w:val="•"/>
-      <w:rPr>
-        <w:color w:val="3370ff"/>
-      </w:rPr>
-    </w:lvl>
-  </w:abstractNum>
-  <w:abstractNum w:abstractNumId="2747761">
-    <w:lvl>
-      <w:numFmt w:val="bullet"/>
-      <w:suff w:val="tab"/>
-      <w:lvlText w:val="•"/>
-      <w:rPr>
-        <w:color w:val="3370ff"/>
-      </w:rPr>
-    </w:lvl>
-  </w:abstractNum>
-  <w:abstractNum w:abstractNumId="2747762">
-    <w:lvl>
-      <w:numFmt w:val="bullet"/>
-      <w:suff w:val="tab"/>
-      <w:lvlText w:val="•"/>
-      <w:rPr>
-        <w:color w:val="3370ff"/>
-      </w:rPr>
-    </w:lvl>
-  </w:abstractNum>
-  <w:abstractNum w:abstractNumId="2747763">
-    <w:lvl>
-      <w:numFmt w:val="bullet"/>
-      <w:suff w:val="tab"/>
-      <w:lvlText w:val="•"/>
-      <w:rPr>
-        <w:color w:val="3370ff"/>
-      </w:rPr>
-    </w:lvl>
-  </w:abstractNum>
-  <w:abstractNum w:abstractNumId="2747764">
-    <w:lvl>
-      <w:numFmt w:val="bullet"/>
-      <w:suff w:val="tab"/>
-      <w:lvlText w:val="•"/>
-      <w:rPr>
-        <w:color w:val="3370ff"/>
-      </w:rPr>
-    </w:lvl>
-  </w:abstractNum>
-  <w:abstractNum w:abstractNumId="2747765">
-    <w:lvl>
-      <w:numFmt w:val="bullet"/>
-      <w:suff w:val="tab"/>
-      <w:lvlText w:val="•"/>
-      <w:rPr>
-        <w:color w:val="3370ff"/>
-      </w:rPr>
-    </w:lvl>
-  </w:abstractNum>
-  <w:abstractNum w:abstractNumId="2747766">
-    <w:lvl>
-      <w:numFmt w:val="bullet"/>
-      <w:suff w:val="tab"/>
-      <w:lvlText w:val="•"/>
-      <w:rPr>
-        <w:color w:val="3370ff"/>
-      </w:rPr>
-    </w:lvl>
-  </w:abstractNum>
-  <w:abstractNum w:abstractNumId="2747767">
-    <w:lvl>
-      <w:numFmt w:val="bullet"/>
-      <w:suff w:val="tab"/>
-      <w:lvlText w:val="•"/>
-      <w:rPr>
-        <w:color w:val="3370ff"/>
-      </w:rPr>
-    </w:lvl>
-  </w:abstractNum>
-  <w:abstractNum w:abstractNumId="2747768">
-    <w:lvl>
-      <w:numFmt w:val="bullet"/>
-      <w:suff w:val="tab"/>
-      <w:lvlText w:val="•"/>
-      <w:rPr>
-        <w:color w:val="3370ff"/>
-      </w:rPr>
-    </w:lvl>
-  </w:abstractNum>
-  <w:abstractNum w:abstractNumId="2747769">
-    <w:lvl>
-      <w:numFmt w:val="bullet"/>
-      <w:suff w:val="tab"/>
-      <w:lvlText w:val="•"/>
-      <w:rPr>
-        <w:color w:val="3370ff"/>
-      </w:rPr>
-    </w:lvl>
-  </w:abstractNum>
-  <w:abstractNum w:abstractNumId="2747770">
-    <w:lvl>
-      <w:numFmt w:val="bullet"/>
-      <w:suff w:val="tab"/>
-      <w:lvlText w:val="•"/>
-      <w:rPr>
-        <w:color w:val="3370ff"/>
-      </w:rPr>
-    </w:lvl>
-  </w:abstractNum>
-  <w:abstractNum w:abstractNumId="2747771">
-    <w:lvl>
-      <w:numFmt w:val="bullet"/>
-      <w:suff w:val="tab"/>
-      <w:lvlText w:val="•"/>
-      <w:rPr>
-        <w:color w:val="3370ff"/>
-      </w:rPr>
-    </w:lvl>
-  </w:abstractNum>
-  <w:abstractNum w:abstractNumId="2747772">
-    <w:lvl>
-      <w:numFmt w:val="bullet"/>
-      <w:suff w:val="tab"/>
-      <w:lvlText w:val="•"/>
-      <w:rPr>
-        <w:color w:val="3370ff"/>
-      </w:rPr>
-    </w:lvl>
-  </w:abstractNum>
-  <w:abstractNum w:abstractNumId="2747773">
-    <w:lvl>
-      <w:numFmt w:val="bullet"/>
-      <w:suff w:val="tab"/>
-      <w:lvlText w:val="•"/>
-      <w:rPr>
-        <w:color w:val="3370ff"/>
-      </w:rPr>
-    </w:lvl>
-  </w:abstractNum>
-  <w:abstractNum w:abstractNumId="2747774">
-    <w:lvl>
-      <w:numFmt w:val="bullet"/>
-      <w:suff w:val="tab"/>
-      <w:lvlText w:val="•"/>
-      <w:rPr>
-        <w:color w:val="3370ff"/>
-      </w:rPr>
-    </w:lvl>
-  </w:abstractNum>
-  <w:abstractNum w:abstractNumId="2747775">
-    <w:lvl>
-      <w:numFmt w:val="bullet"/>
-      <w:suff w:val="tab"/>
-      <w:lvlText w:val="•"/>
-      <w:rPr>
-        <w:color w:val="3370ff"/>
-      </w:rPr>
-    </w:lvl>
-  </w:abstractNum>
-  <w:abstractNum w:abstractNumId="2747776">
-    <w:lvl>
-      <w:numFmt w:val="bullet"/>
-      <w:suff w:val="tab"/>
-      <w:lvlText w:val="•"/>
-      <w:rPr>
-        <w:color w:val="3370ff"/>
-      </w:rPr>
-    </w:lvl>
-  </w:abstractNum>
-  <w:abstractNum w:abstractNumId="2747777">
-    <w:lvl>
-      <w:numFmt w:val="bullet"/>
-      <w:suff w:val="tab"/>
-      <w:lvlText w:val="•"/>
-      <w:rPr>
-        <w:color w:val="3370ff"/>
-      </w:rPr>
-    </w:lvl>
-  </w:abstractNum>
-  <w:abstractNum w:abstractNumId="2747778">
-    <w:lvl>
-      <w:numFmt w:val="bullet"/>
-      <w:suff w:val="tab"/>
-      <w:lvlText w:val="•"/>
-      <w:rPr>
-        <w:color w:val="3370ff"/>
-      </w:rPr>
-    </w:lvl>
-  </w:abstractNum>
-  <w:abstractNum w:abstractNumId="2747779">
-    <w:lvl>
-      <w:numFmt w:val="bullet"/>
-      <w:suff w:val="tab"/>
-      <w:lvlText w:val="•"/>
-      <w:rPr>
-        <w:color w:val="3370ff"/>
-      </w:rPr>
-    </w:lvl>
-  </w:abstractNum>
-  <w:abstractNum w:abstractNumId="2747780">
-    <w:lvl>
-      <w:numFmt w:val="bullet"/>
-      <w:suff w:val="tab"/>
-      <w:lvlText w:val="•"/>
-      <w:rPr>
-        <w:color w:val="3370ff"/>
-      </w:rPr>
-    </w:lvl>
-  </w:abstractNum>
-  <w:abstractNum w:abstractNumId="2747781">
-    <w:lvl>
-      <w:numFmt w:val="bullet"/>
-      <w:suff w:val="tab"/>
-      <w:lvlText w:val="•"/>
-      <w:rPr>
-        <w:color w:val="3370ff"/>
-      </w:rPr>
-    </w:lvl>
-  </w:abstractNum>
-  <w:abstractNum w:abstractNumId="2747782">
-    <w:lvl>
-      <w:numFmt w:val="bullet"/>
-      <w:suff w:val="tab"/>
-      <w:lvlText w:val="•"/>
-      <w:rPr>
-        <w:color w:val="3370ff"/>
-      </w:rPr>
-    </w:lvl>
-  </w:abstractNum>
-  <w:abstractNum w:abstractNumId="2747783">
-    <w:lvl>
-      <w:numFmt w:val="bullet"/>
-      <w:suff w:val="tab"/>
-      <w:lvlText w:val="•"/>
-      <w:rPr>
-        <w:color w:val="3370ff"/>
-      </w:rPr>
-    </w:lvl>
-  </w:abstractNum>
-  <w:abstractNum w:abstractNumId="2747784">
-    <w:lvl>
-      <w:numFmt w:val="bullet"/>
-      <w:suff w:val="tab"/>
-      <w:lvlText w:val="•"/>
-      <w:rPr>
-        <w:color w:val="3370ff"/>
-      </w:rPr>
-    </w:lvl>
-  </w:abstractNum>
-  <w:abstractNum w:abstractNumId="2747785">
-    <w:lvl>
-      <w:numFmt w:val="bullet"/>
-      <w:suff w:val="tab"/>
-      <w:lvlText w:val="•"/>
-      <w:rPr>
-        <w:color w:val="3370ff"/>
-      </w:rPr>
-    </w:lvl>
-  </w:abstractNum>
-  <w:abstractNum w:abstractNumId="2747786">
-    <w:lvl>
-      <w:numFmt w:val="bullet"/>
-      <w:suff w:val="tab"/>
-      <w:lvlText w:val="•"/>
-      <w:rPr>
-        <w:color w:val="3370ff"/>
-      </w:rPr>
-    </w:lvl>
-  </w:abstractNum>
-  <w:abstractNum w:abstractNumId="2747787">
-    <w:lvl>
-      <w:numFmt w:val="bullet"/>
-      <w:suff w:val="tab"/>
-      <w:lvlText w:val="•"/>
-      <w:rPr>
-        <w:color w:val="3370ff"/>
-      </w:rPr>
-    </w:lvl>
-  </w:abstractNum>
-  <w:abstractNum w:abstractNumId="2747788">
-    <w:lvl>
-      <w:numFmt w:val="bullet"/>
-      <w:suff w:val="tab"/>
-      <w:lvlText w:val="•"/>
-      <w:rPr>
-        <w:color w:val="3370ff"/>
-      </w:rPr>
-    </w:lvl>
-  </w:abstractNum>
-  <w:abstractNum w:abstractNumId="2747789">
-    <w:lvl>
-      <w:numFmt w:val="bullet"/>
-      <w:suff w:val="tab"/>
-      <w:lvlText w:val="•"/>
-      <w:rPr>
-        <w:color w:val="3370ff"/>
-      </w:rPr>
-    </w:lvl>
-  </w:abstractNum>
-  <w:abstractNum w:abstractNumId="2747790">
-    <w:lvl>
-      <w:numFmt w:val="bullet"/>
-      <w:suff w:val="tab"/>
-      <w:lvlText w:val="•"/>
-      <w:rPr>
-        <w:color w:val="3370ff"/>
-      </w:rPr>
-    </w:lvl>
-  </w:abstractNum>
-  <w:abstractNum w:abstractNumId="2747791">
-    <w:lvl>
-      <w:numFmt w:val="bullet"/>
-      <w:suff w:val="tab"/>
-      <w:lvlText w:val="•"/>
-      <w:rPr>
-        <w:color w:val="3370ff"/>
-      </w:rPr>
-    </w:lvl>
-  </w:abstractNum>
-  <w:abstractNum w:abstractNumId="2747792">
-    <w:lvl>
-      <w:numFmt w:val="bullet"/>
-      <w:suff w:val="tab"/>
-      <w:lvlText w:val="•"/>
-      <w:rPr>
-        <w:color w:val="3370ff"/>
-      </w:rPr>
-    </w:lvl>
-  </w:abstractNum>
-  <w:abstractNum w:abstractNumId="2747793">
-    <w:lvl>
-      <w:numFmt w:val="bullet"/>
-      <w:suff w:val="tab"/>
-      <w:lvlText w:val="•"/>
-      <w:rPr>
-        <w:color w:val="3370ff"/>
-      </w:rPr>
-    </w:lvl>
-  </w:abstractNum>
-  <w:abstractNum w:abstractNumId="2747794">
-    <w:lvl>
-      <w:numFmt w:val="bullet"/>
-      <w:suff w:val="tab"/>
-      <w:lvlText w:val="•"/>
-      <w:rPr>
-        <w:color w:val="3370ff"/>
-      </w:rPr>
-    </w:lvl>
-  </w:abstractNum>
-  <w:abstractNum w:abstractNumId="2747795">
-    <w:lvl>
-      <w:numFmt w:val="bullet"/>
-      <w:suff w:val="tab"/>
-      <w:lvlText w:val="•"/>
-      <w:rPr>
-        <w:color w:val="3370ff"/>
-      </w:rPr>
-    </w:lvl>
-  </w:abstractNum>
-  <w:abstractNum w:abstractNumId="2747796">
-    <w:lvl>
-      <w:numFmt w:val="bullet"/>
-      <w:suff w:val="tab"/>
-      <w:lvlText w:val="•"/>
-      <w:rPr>
-        <w:color w:val="3370ff"/>
-      </w:rPr>
-    </w:lvl>
-  </w:abstractNum>
-  <w:abstractNum w:abstractNumId="2747797">
-    <w:lvl>
-      <w:numFmt w:val="bullet"/>
-      <w:suff w:val="tab"/>
-      <w:lvlText w:val="•"/>
-      <w:rPr>
-        <w:color w:val="3370ff"/>
-      </w:rPr>
-    </w:lvl>
-  </w:abstractNum>
-  <w:abstractNum w:abstractNumId="2747798">
-    <w:lvl>
-      <w:numFmt w:val="bullet"/>
-      <w:suff w:val="tab"/>
-      <w:lvlText w:val="•"/>
-      <w:rPr>
-        <w:color w:val="3370ff"/>
-      </w:rPr>
-    </w:lvl>
-  </w:abstractNum>
-  <w:abstractNum w:abstractNumId="2747799">
-    <w:lvl>
-      <w:numFmt w:val="bullet"/>
-      <w:suff w:val="tab"/>
-      <w:lvlText w:val="•"/>
-      <w:rPr>
-        <w:color w:val="3370ff"/>
-      </w:rPr>
-    </w:lvl>
-  </w:abstractNum>
-  <w:abstractNum w:abstractNumId="2747800">
-    <w:lvl>
-      <w:numFmt w:val="bullet"/>
-      <w:suff w:val="tab"/>
-      <w:lvlText w:val="•"/>
-      <w:rPr>
-        <w:color w:val="3370ff"/>
-      </w:rPr>
-    </w:lvl>
-  </w:abstractNum>
-  <w:abstractNum w:abstractNumId="2747801">
-    <w:lvl>
-      <w:numFmt w:val="bullet"/>
-      <w:suff w:val="tab"/>
-      <w:lvlText w:val="•"/>
-      <w:rPr>
-        <w:color w:val="3370ff"/>
-      </w:rPr>
-    </w:lvl>
-  </w:abstractNum>
-  <w:abstractNum w:abstractNumId="2747802">
-    <w:lvl>
-      <w:numFmt w:val="bullet"/>
-      <w:suff w:val="tab"/>
-      <w:lvlText w:val="•"/>
-      <w:rPr>
-        <w:color w:val="3370ff"/>
-      </w:rPr>
-    </w:lvl>
-  </w:abstractNum>
-  <w:abstractNum w:abstractNumId="2747803">
-    <w:lvl>
-      <w:numFmt w:val="bullet"/>
-      <w:suff w:val="tab"/>
-      <w:lvlText w:val="•"/>
-      <w:rPr>
-        <w:color w:val="3370ff"/>
-      </w:rPr>
-    </w:lvl>
-  </w:abstractNum>
-  <w:abstractNum w:abstractNumId="2747804">
-    <w:lvl>
-      <w:numFmt w:val="bullet"/>
-      <w:suff w:val="tab"/>
-      <w:lvlText w:val="•"/>
-      <w:rPr>
-        <w:color w:val="3370ff"/>
-      </w:rPr>
-    </w:lvl>
-  </w:abstractNum>
-  <w:abstractNum w:abstractNumId="2747805">
-    <w:lvl>
-      <w:numFmt w:val="bullet"/>
-      <w:suff w:val="tab"/>
-      <w:lvlText w:val="•"/>
-      <w:rPr>
-        <w:color w:val="3370ff"/>
-      </w:rPr>
-    </w:lvl>
-  </w:abstractNum>
-  <w:abstractNum w:abstractNumId="2747806">
-    <w:lvl>
-      <w:numFmt w:val="bullet"/>
-      <w:suff w:val="tab"/>
-      <w:lvlText w:val="•"/>
-      <w:rPr>
-        <w:color w:val="3370ff"/>
-      </w:rPr>
-    </w:lvl>
-  </w:abstractNum>
-  <w:abstractNum w:abstractNumId="2747807">
-    <w:lvl>
-      <w:numFmt w:val="bullet"/>
-      <w:suff w:val="tab"/>
-      <w:lvlText w:val="•"/>
-      <w:rPr>
-        <w:color w:val="3370ff"/>
-      </w:rPr>
-    </w:lvl>
-  </w:abstractNum>
-  <w:abstractNum w:abstractNumId="2747808">
-    <w:lvl>
-      <w:numFmt w:val="bullet"/>
-      <w:suff w:val="tab"/>
-      <w:lvlText w:val="•"/>
-      <w:rPr>
-        <w:color w:val="3370ff"/>
-      </w:rPr>
-    </w:lvl>
-  </w:abstractNum>
-  <w:abstractNum w:abstractNumId="2747809">
-    <w:lvl>
-      <w:numFmt w:val="bullet"/>
-      <w:suff w:val="tab"/>
-      <w:lvlText w:val="•"/>
-      <w:rPr>
-        <w:color w:val="3370ff"/>
-      </w:rPr>
-    </w:lvl>
-  </w:abstractNum>
-  <w:abstractNum w:abstractNumId="2747810">
-    <w:lvl>
-      <w:numFmt w:val="bullet"/>
-      <w:suff w:val="tab"/>
-      <w:lvlText w:val="•"/>
-      <w:rPr>
-        <w:color w:val="3370ff"/>
-      </w:rPr>
-    </w:lvl>
-  </w:abstractNum>
-  <w:abstractNum w:abstractNumId="2747811">
-    <w:lvl>
-      <w:numFmt w:val="bullet"/>
-      <w:suff w:val="tab"/>
-      <w:lvlText w:val="•"/>
-      <w:rPr>
-        <w:color w:val="3370ff"/>
-      </w:rPr>
-    </w:lvl>
-  </w:abstractNum>
-  <w:abstractNum w:abstractNumId="2747812">
-    <w:lvl>
-      <w:numFmt w:val="bullet"/>
-      <w:suff w:val="tab"/>
-      <w:lvlText w:val="•"/>
-      <w:rPr>
-        <w:color w:val="3370ff"/>
-      </w:rPr>
-    </w:lvl>
-  </w:abstractNum>
-  <w:abstractNum w:abstractNumId="2747813">
-    <w:lvl>
-      <w:numFmt w:val="bullet"/>
-      <w:suff w:val="tab"/>
-      <w:lvlText w:val="•"/>
-      <w:rPr>
-        <w:color w:val="3370ff"/>
-      </w:rPr>
-    </w:lvl>
-  </w:abstractNum>
-  <w:abstractNum w:abstractNumId="2747814">
-    <w:lvl>
-      <w:numFmt w:val="bullet"/>
-      <w:suff w:val="tab"/>
-      <w:lvlText w:val="•"/>
-      <w:rPr>
-        <w:color w:val="3370ff"/>
-      </w:rPr>
-    </w:lvl>
-  </w:abstractNum>
-  <w:abstractNum w:abstractNumId="2747815">
-    <w:lvl>
-      <w:numFmt w:val="bullet"/>
-      <w:suff w:val="tab"/>
-      <w:lvlText w:val="•"/>
-      <w:rPr>
-        <w:color w:val="3370ff"/>
-      </w:rPr>
-    </w:lvl>
-  </w:abstractNum>
-  <w:abstractNum w:abstractNumId="2747816">
-    <w:lvl>
-      <w:numFmt w:val="bullet"/>
-      <w:suff w:val="tab"/>
-      <w:lvlText w:val="•"/>
-      <w:rPr>
-        <w:color w:val="3370ff"/>
-      </w:rPr>
-    </w:lvl>
-  </w:abstractNum>
-  <w:abstractNum w:abstractNumId="2747817">
-    <w:lvl>
-      <w:numFmt w:val="bullet"/>
-      <w:suff w:val="tab"/>
-      <w:lvlText w:val="•"/>
-      <w:rPr>
-        <w:color w:val="3370ff"/>
-      </w:rPr>
-    </w:lvl>
-  </w:abstractNum>
-  <w:abstractNum w:abstractNumId="2747818">
-    <w:lvl>
-      <w:numFmt w:val="bullet"/>
-      <w:suff w:val="tab"/>
-      <w:lvlText w:val="•"/>
-      <w:rPr>
-        <w:color w:val="3370ff"/>
-      </w:rPr>
-    </w:lvl>
-  </w:abstractNum>
-  <w:abstractNum w:abstractNumId="2747819">
-    <w:lvl>
-      <w:numFmt w:val="bullet"/>
-      <w:suff w:val="tab"/>
-      <w:lvlText w:val="•"/>
-      <w:rPr>
-        <w:color w:val="3370ff"/>
-      </w:rPr>
-    </w:lvl>
-  </w:abstractNum>
-  <w:abstractNum w:abstractNumId="2747820">
-    <w:lvl>
-      <w:numFmt w:val="bullet"/>
-      <w:suff w:val="tab"/>
-      <w:lvlText w:val="•"/>
-      <w:rPr>
-        <w:color w:val="3370ff"/>
-      </w:rPr>
-    </w:lvl>
-  </w:abstractNum>
-  <w:abstractNum w:abstractNumId="2747821">
-    <w:lvl>
-      <w:numFmt w:val="bullet"/>
-      <w:suff w:val="tab"/>
-      <w:lvlText w:val="•"/>
-      <w:rPr>
-        <w:color w:val="3370ff"/>
-      </w:rPr>
-    </w:lvl>
-  </w:abstractNum>
-  <w:abstractNum w:abstractNumId="2747822">
-    <w:lvl>
-      <w:numFmt w:val="bullet"/>
-      <w:suff w:val="tab"/>
-      <w:lvlText w:val="•"/>
-      <w:rPr>
-        <w:color w:val="3370ff"/>
-      </w:rPr>
-    </w:lvl>
-  </w:abstractNum>
-  <w:abstractNum w:abstractNumId="2747823">
-    <w:lvl>
-      <w:numFmt w:val="bullet"/>
-      <w:suff w:val="tab"/>
-      <w:lvlText w:val="•"/>
-      <w:rPr>
-        <w:color w:val="3370ff"/>
-      </w:rPr>
-    </w:lvl>
-  </w:abstractNum>
-  <w:abstractNum w:abstractNumId="2747824">
-    <w:lvl>
-      <w:numFmt w:val="bullet"/>
-      <w:suff w:val="tab"/>
-      <w:lvlText w:val="•"/>
-      <w:rPr>
-        <w:color w:val="3370ff"/>
-      </w:rPr>
-    </w:lvl>
-  </w:abstractNum>
-  <w:abstractNum w:abstractNumId="2747825">
-    <w:lvl>
-      <w:numFmt w:val="bullet"/>
-      <w:suff w:val="tab"/>
-      <w:lvlText w:val="•"/>
-      <w:rPr>
-        <w:color w:val="3370ff"/>
-      </w:rPr>
-    </w:lvl>
-  </w:abstractNum>
-  <w:abstractNum w:abstractNumId="2747826">
-    <w:lvl>
-      <w:numFmt w:val="bullet"/>
-      <w:suff w:val="tab"/>
-      <w:lvlText w:val="•"/>
-      <w:rPr>
-        <w:color w:val="3370ff"/>
-      </w:rPr>
-    </w:lvl>
-  </w:abstractNum>
-  <w:abstractNum w:abstractNumId="2747827">
-    <w:lvl>
-      <w:numFmt w:val="bullet"/>
-      <w:suff w:val="tab"/>
-      <w:lvlText w:val="•"/>
-      <w:rPr>
-        <w:color w:val="3370ff"/>
-      </w:rPr>
-    </w:lvl>
-  </w:abstractNum>
-  <w:abstractNum w:abstractNumId="2747828">
-    <w:lvl>
-      <w:numFmt w:val="bullet"/>
-      <w:suff w:val="tab"/>
-      <w:lvlText w:val="•"/>
-      <w:rPr>
-        <w:color w:val="3370ff"/>
-      </w:rPr>
-    </w:lvl>
-  </w:abstractNum>
-  <w:abstractNum w:abstractNumId="2747829">
-    <w:lvl>
-      <w:numFmt w:val="bullet"/>
-      <w:suff w:val="tab"/>
-      <w:lvlText w:val="•"/>
-      <w:rPr>
-        <w:color w:val="3370ff"/>
-      </w:rPr>
-    </w:lvl>
-  </w:abstractNum>
-  <w:abstractNum w:abstractNumId="2747830">
-    <w:lvl>
-      <w:numFmt w:val="bullet"/>
-      <w:suff w:val="tab"/>
-      <w:lvlText w:val="•"/>
-      <w:rPr>
-        <w:color w:val="3370ff"/>
-      </w:rPr>
-    </w:lvl>
-  </w:abstractNum>
-  <w:abstractNum w:abstractNumId="2747831">
-    <w:lvl>
-      <w:numFmt w:val="bullet"/>
-      <w:suff w:val="tab"/>
-      <w:lvlText w:val="•"/>
-      <w:rPr>
-        <w:color w:val="3370ff"/>
-      </w:rPr>
-    </w:lvl>
-  </w:abstractNum>
-  <w:abstractNum w:abstractNumId="2747832">
-    <w:lvl>
-      <w:numFmt w:val="bullet"/>
-      <w:suff w:val="tab"/>
-      <w:lvlText w:val="•"/>
-      <w:rPr>
-        <w:color w:val="3370ff"/>
-      </w:rPr>
-    </w:lvl>
-  </w:abstractNum>
-  <w:abstractNum w:abstractNumId="2747833">
-    <w:lvl>
-      <w:numFmt w:val="bullet"/>
-      <w:suff w:val="tab"/>
-      <w:lvlText w:val="•"/>
-      <w:rPr>
-        <w:color w:val="3370ff"/>
-      </w:rPr>
-    </w:lvl>
-  </w:abstractNum>
-  <w:abstractNum w:abstractNumId="2747834">
-    <w:lvl>
-      <w:numFmt w:val="bullet"/>
-      <w:suff w:val="tab"/>
-      <w:lvlText w:val="•"/>
-      <w:rPr>
-        <w:color w:val="3370ff"/>
-      </w:rPr>
-    </w:lvl>
-  </w:abstractNum>
-  <w:abstractNum w:abstractNumId="2747835">
-    <w:lvl>
-      <w:numFmt w:val="bullet"/>
-      <w:suff w:val="tab"/>
-      <w:lvlText w:val="•"/>
-      <w:rPr>
-        <w:color w:val="3370ff"/>
-      </w:rPr>
-    </w:lvl>
-  </w:abstractNum>
-  <w:abstractNum w:abstractNumId="2747836">
-    <w:lvl>
-      <w:numFmt w:val="bullet"/>
-      <w:suff w:val="tab"/>
-      <w:lvlText w:val="•"/>
-      <w:rPr>
-        <w:color w:val="3370ff"/>
-      </w:rPr>
-    </w:lvl>
-  </w:abstractNum>
-  <w:abstractNum w:abstractNumId="2747837">
-    <w:lvl>
-      <w:numFmt w:val="bullet"/>
-      <w:suff w:val="tab"/>
-      <w:lvlText w:val="•"/>
-      <w:rPr>
-        <w:color w:val="3370ff"/>
-      </w:rPr>
-    </w:lvl>
-  </w:abstractNum>
-  <w:abstractNum w:abstractNumId="2747838">
-    <w:lvl>
-      <w:numFmt w:val="bullet"/>
-      <w:suff w:val="tab"/>
-      <w:lvlText w:val="•"/>
-      <w:rPr>
-        <w:color w:val="3370ff"/>
-      </w:rPr>
-    </w:lvl>
-  </w:abstractNum>
-  <w:abstractNum w:abstractNumId="2747839">
-    <w:lvl>
-      <w:numFmt w:val="bullet"/>
-      <w:suff w:val="tab"/>
-      <w:lvlText w:val="•"/>
-      <w:rPr>
-        <w:color w:val="3370ff"/>
-      </w:rPr>
-    </w:lvl>
-  </w:abstractNum>
-  <w:abstractNum w:abstractNumId="2747840">
-    <w:lvl>
-      <w:numFmt w:val="bullet"/>
-      <w:suff w:val="tab"/>
-      <w:lvlText w:val="•"/>
-      <w:rPr>
-        <w:color w:val="3370ff"/>
-      </w:rPr>
-    </w:lvl>
-  </w:abstractNum>
-  <w:abstractNum w:abstractNumId="2747841">
-    <w:lvl>
-      <w:numFmt w:val="bullet"/>
-      <w:suff w:val="tab"/>
-      <w:lvlText w:val="•"/>
-      <w:rPr>
-        <w:color w:val="3370ff"/>
-      </w:rPr>
-    </w:lvl>
-  </w:abstractNum>
-  <w:abstractNum w:abstractNumId="2747842">
-    <w:lvl>
-      <w:numFmt w:val="bullet"/>
-      <w:suff w:val="tab"/>
-      <w:lvlText w:val="•"/>
-      <w:rPr>
-        <w:color w:val="3370ff"/>
-      </w:rPr>
-    </w:lvl>
-  </w:abstractNum>
-  <w:abstractNum w:abstractNumId="2747843">
-    <w:lvl>
-      <w:numFmt w:val="bullet"/>
-      <w:suff w:val="tab"/>
-      <w:lvlText w:val="•"/>
-      <w:rPr>
-        <w:color w:val="3370ff"/>
-      </w:rPr>
-    </w:lvl>
-  </w:abstractNum>
-  <w:abstractNum w:abstractNumId="2747844">
-    <w:lvl>
-      <w:numFmt w:val="bullet"/>
-      <w:suff w:val="tab"/>
-      <w:lvlText w:val="•"/>
-      <w:rPr>
-        <w:color w:val="3370ff"/>
-      </w:rPr>
-    </w:lvl>
-  </w:abstractNum>
-  <w:abstractNum w:abstractNumId="2747845">
-    <w:lvl>
-      <w:numFmt w:val="bullet"/>
-      <w:suff w:val="tab"/>
-      <w:lvlText w:val="•"/>
-      <w:rPr>
-        <w:color w:val="3370ff"/>
-      </w:rPr>
-    </w:lvl>
-  </w:abstractNum>
-  <w:abstractNum w:abstractNumId="2747846">
-    <w:lvl>
-      <w:numFmt w:val="bullet"/>
-      <w:suff w:val="tab"/>
-      <w:lvlText w:val="•"/>
-      <w:rPr>
-        <w:color w:val="3370ff"/>
-      </w:rPr>
-    </w:lvl>
-  </w:abstractNum>
-  <w:abstractNum w:abstractNumId="2747847">
-    <w:lvl>
-      <w:numFmt w:val="bullet"/>
-      <w:suff w:val="tab"/>
-      <w:lvlText w:val="•"/>
-      <w:rPr>
-        <w:color w:val="3370ff"/>
-      </w:rPr>
-    </w:lvl>
-  </w:abstractNum>
-  <w:abstractNum w:abstractNumId="2747848">
-    <w:lvl>
-      <w:numFmt w:val="bullet"/>
-      <w:suff w:val="tab"/>
-      <w:lvlText w:val="•"/>
-      <w:rPr>
-        <w:color w:val="3370ff"/>
-      </w:rPr>
-    </w:lvl>
-  </w:abstractNum>
-  <w:abstractNum w:abstractNumId="2747849">
-    <w:lvl>
-      <w:numFmt w:val="bullet"/>
-      <w:suff w:val="tab"/>
-      <w:lvlText w:val="•"/>
-      <w:rPr>
-        <w:color w:val="3370ff"/>
-      </w:rPr>
-    </w:lvl>
-  </w:abstractNum>
-  <w:abstractNum w:abstractNumId="2747850">
-    <w:lvl>
-      <w:numFmt w:val="bullet"/>
-      <w:suff w:val="tab"/>
-      <w:lvlText w:val="•"/>
-      <w:rPr>
-        <w:color w:val="3370ff"/>
-      </w:rPr>
-    </w:lvl>
-  </w:abstractNum>
-  <w:abstractNum w:abstractNumId="2747851">
-    <w:lvl>
-      <w:numFmt w:val="bullet"/>
-      <w:suff w:val="tab"/>
-      <w:lvlText w:val="•"/>
-      <w:rPr>
-        <w:color w:val="3370ff"/>
-      </w:rPr>
-    </w:lvl>
-  </w:abstractNum>
-  <w:abstractNum w:abstractNumId="2747852">
-    <w:lvl>
-      <w:numFmt w:val="bullet"/>
-      <w:suff w:val="tab"/>
-      <w:lvlText w:val="•"/>
-      <w:rPr>
-        <w:color w:val="3370ff"/>
-      </w:rPr>
-    </w:lvl>
-  </w:abstractNum>
-  <w:abstractNum w:abstractNumId="2747853">
+  <w:abstractNum w:abstractNumId="111084">
+    <w:lvl>
+      <w:numFmt w:val="bullet"/>
+      <w:suff w:val="tab"/>
+      <w:lvlText w:val="•"/>
+      <w:rPr>
+        <w:color w:val="3370ff"/>
+      </w:rPr>
+    </w:lvl>
+  </w:abstractNum>
+  <w:abstractNum w:abstractNumId="111085">
+    <w:lvl>
+      <w:numFmt w:val="bullet"/>
+      <w:suff w:val="tab"/>
+      <w:lvlText w:val="•"/>
+      <w:rPr>
+        <w:color w:val="3370ff"/>
+      </w:rPr>
+    </w:lvl>
+  </w:abstractNum>
+  <w:abstractNum w:abstractNumId="111086">
+    <w:lvl>
+      <w:numFmt w:val="bullet"/>
+      <w:suff w:val="tab"/>
+      <w:lvlText w:val="•"/>
+      <w:rPr>
+        <w:color w:val="3370ff"/>
+      </w:rPr>
+    </w:lvl>
+  </w:abstractNum>
+  <w:abstractNum w:abstractNumId="111087">
+    <w:lvl>
+      <w:numFmt w:val="bullet"/>
+      <w:suff w:val="tab"/>
+      <w:lvlText w:val="•"/>
+      <w:rPr>
+        <w:color w:val="3370ff"/>
+      </w:rPr>
+    </w:lvl>
+  </w:abstractNum>
+  <w:abstractNum w:abstractNumId="111088">
+    <w:lvl>
+      <w:numFmt w:val="bullet"/>
+      <w:suff w:val="tab"/>
+      <w:lvlText w:val="•"/>
+      <w:rPr>
+        <w:color w:val="3370ff"/>
+      </w:rPr>
+    </w:lvl>
+  </w:abstractNum>
+  <w:abstractNum w:abstractNumId="111089">
+    <w:lvl>
+      <w:numFmt w:val="bullet"/>
+      <w:suff w:val="tab"/>
+      <w:lvlText w:val="•"/>
+      <w:rPr>
+        <w:color w:val="3370ff"/>
+      </w:rPr>
+    </w:lvl>
+  </w:abstractNum>
+  <w:abstractNum w:abstractNumId="111090">
+    <w:lvl>
+      <w:numFmt w:val="bullet"/>
+      <w:suff w:val="tab"/>
+      <w:lvlText w:val="•"/>
+      <w:rPr>
+        <w:color w:val="3370ff"/>
+      </w:rPr>
+    </w:lvl>
+  </w:abstractNum>
+  <w:abstractNum w:abstractNumId="111091">
+    <w:lvl>
+      <w:numFmt w:val="bullet"/>
+      <w:suff w:val="tab"/>
+      <w:lvlText w:val="•"/>
+      <w:rPr>
+        <w:color w:val="3370ff"/>
+      </w:rPr>
+    </w:lvl>
+  </w:abstractNum>
+  <w:abstractNum w:abstractNumId="111092">
+    <w:lvl>
+      <w:numFmt w:val="bullet"/>
+      <w:suff w:val="tab"/>
+      <w:lvlText w:val="•"/>
+      <w:rPr>
+        <w:color w:val="3370ff"/>
+      </w:rPr>
+    </w:lvl>
+  </w:abstractNum>
+  <w:abstractNum w:abstractNumId="111093">
+    <w:lvl>
+      <w:numFmt w:val="bullet"/>
+      <w:suff w:val="tab"/>
+      <w:lvlText w:val="•"/>
+      <w:rPr>
+        <w:color w:val="3370ff"/>
+      </w:rPr>
+    </w:lvl>
+  </w:abstractNum>
+  <w:abstractNum w:abstractNumId="111094">
+    <w:lvl>
+      <w:numFmt w:val="bullet"/>
+      <w:suff w:val="tab"/>
+      <w:lvlText w:val="•"/>
+      <w:rPr>
+        <w:color w:val="3370ff"/>
+      </w:rPr>
+    </w:lvl>
+  </w:abstractNum>
+  <w:abstractNum w:abstractNumId="111095">
+    <w:lvl>
+      <w:numFmt w:val="bullet"/>
+      <w:suff w:val="tab"/>
+      <w:lvlText w:val="•"/>
+      <w:rPr>
+        <w:color w:val="3370ff"/>
+      </w:rPr>
+    </w:lvl>
+  </w:abstractNum>
+  <w:abstractNum w:abstractNumId="111096">
+    <w:lvl>
+      <w:numFmt w:val="bullet"/>
+      <w:suff w:val="tab"/>
+      <w:lvlText w:val="•"/>
+      <w:rPr>
+        <w:color w:val="3370ff"/>
+      </w:rPr>
+    </w:lvl>
+  </w:abstractNum>
+  <w:abstractNum w:abstractNumId="111097">
+    <w:lvl>
+      <w:numFmt w:val="bullet"/>
+      <w:suff w:val="tab"/>
+      <w:lvlText w:val="•"/>
+      <w:rPr>
+        <w:color w:val="3370ff"/>
+      </w:rPr>
+    </w:lvl>
+  </w:abstractNum>
+  <w:abstractNum w:abstractNumId="111098">
+    <w:lvl>
+      <w:numFmt w:val="bullet"/>
+      <w:suff w:val="tab"/>
+      <w:lvlText w:val="•"/>
+      <w:rPr>
+        <w:color w:val="3370ff"/>
+      </w:rPr>
+    </w:lvl>
+  </w:abstractNum>
+  <w:abstractNum w:abstractNumId="111099">
+    <w:lvl>
+      <w:numFmt w:val="bullet"/>
+      <w:suff w:val="tab"/>
+      <w:lvlText w:val="•"/>
+      <w:rPr>
+        <w:color w:val="3370ff"/>
+      </w:rPr>
+    </w:lvl>
+  </w:abstractNum>
+  <w:abstractNum w:abstractNumId="111100">
+    <w:lvl>
+      <w:numFmt w:val="bullet"/>
+      <w:suff w:val="tab"/>
+      <w:lvlText w:val="•"/>
+      <w:rPr>
+        <w:color w:val="3370ff"/>
+      </w:rPr>
+    </w:lvl>
+  </w:abstractNum>
+  <w:abstractNum w:abstractNumId="111101">
+    <w:lvl>
+      <w:numFmt w:val="bullet"/>
+      <w:suff w:val="tab"/>
+      <w:lvlText w:val="•"/>
+      <w:rPr>
+        <w:color w:val="3370ff"/>
+      </w:rPr>
+    </w:lvl>
+  </w:abstractNum>
+  <w:abstractNum w:abstractNumId="111102">
+    <w:lvl>
+      <w:numFmt w:val="bullet"/>
+      <w:suff w:val="tab"/>
+      <w:lvlText w:val="•"/>
+      <w:rPr>
+        <w:color w:val="3370ff"/>
+      </w:rPr>
+    </w:lvl>
+  </w:abstractNum>
+  <w:abstractNum w:abstractNumId="111103">
+    <w:lvl>
+      <w:numFmt w:val="bullet"/>
+      <w:suff w:val="tab"/>
+      <w:lvlText w:val="•"/>
+      <w:rPr>
+        <w:color w:val="3370ff"/>
+      </w:rPr>
+    </w:lvl>
+  </w:abstractNum>
+  <w:abstractNum w:abstractNumId="111104">
+    <w:lvl>
+      <w:numFmt w:val="bullet"/>
+      <w:suff w:val="tab"/>
+      <w:lvlText w:val="•"/>
+      <w:rPr>
+        <w:color w:val="3370ff"/>
+      </w:rPr>
+    </w:lvl>
+  </w:abstractNum>
+  <w:abstractNum w:abstractNumId="111105">
+    <w:lvl>
+      <w:numFmt w:val="bullet"/>
+      <w:suff w:val="tab"/>
+      <w:lvlText w:val="•"/>
+      <w:rPr>
+        <w:color w:val="3370ff"/>
+      </w:rPr>
+    </w:lvl>
+  </w:abstractNum>
+  <w:abstractNum w:abstractNumId="111106">
+    <w:lvl>
+      <w:numFmt w:val="bullet"/>
+      <w:suff w:val="tab"/>
+      <w:lvlText w:val="•"/>
+      <w:rPr>
+        <w:color w:val="3370ff"/>
+      </w:rPr>
+    </w:lvl>
+  </w:abstractNum>
+  <w:abstractNum w:abstractNumId="111107">
+    <w:lvl>
+      <w:numFmt w:val="bullet"/>
+      <w:suff w:val="tab"/>
+      <w:lvlText w:val="•"/>
+      <w:rPr>
+        <w:color w:val="3370ff"/>
+      </w:rPr>
+    </w:lvl>
+  </w:abstractNum>
+  <w:abstractNum w:abstractNumId="111108">
+    <w:lvl>
+      <w:numFmt w:val="bullet"/>
+      <w:suff w:val="tab"/>
+      <w:lvlText w:val="•"/>
+      <w:rPr>
+        <w:color w:val="3370ff"/>
+      </w:rPr>
+    </w:lvl>
+  </w:abstractNum>
+  <w:abstractNum w:abstractNumId="111109">
+    <w:lvl>
+      <w:numFmt w:val="bullet"/>
+      <w:suff w:val="tab"/>
+      <w:lvlText w:val="•"/>
+      <w:rPr>
+        <w:color w:val="3370ff"/>
+      </w:rPr>
+    </w:lvl>
+  </w:abstractNum>
+  <w:abstractNum w:abstractNumId="111110">
+    <w:lvl>
+      <w:numFmt w:val="bullet"/>
+      <w:suff w:val="tab"/>
+      <w:lvlText w:val="•"/>
+      <w:rPr>
+        <w:color w:val="3370ff"/>
+      </w:rPr>
+    </w:lvl>
+  </w:abstractNum>
+  <w:abstractNum w:abstractNumId="111111">
+    <w:lvl>
+      <w:numFmt w:val="bullet"/>
+      <w:suff w:val="tab"/>
+      <w:lvlText w:val="•"/>
+      <w:rPr>
+        <w:color w:val="3370ff"/>
+      </w:rPr>
+    </w:lvl>
+  </w:abstractNum>
+  <w:abstractNum w:abstractNumId="111112">
+    <w:lvl>
+      <w:numFmt w:val="bullet"/>
+      <w:suff w:val="tab"/>
+      <w:lvlText w:val="•"/>
+      <w:rPr>
+        <w:color w:val="3370ff"/>
+      </w:rPr>
+    </w:lvl>
+  </w:abstractNum>
+  <w:abstractNum w:abstractNumId="111113">
+    <w:lvl>
+      <w:numFmt w:val="bullet"/>
+      <w:suff w:val="tab"/>
+      <w:lvlText w:val="•"/>
+      <w:rPr>
+        <w:color w:val="3370ff"/>
+      </w:rPr>
+    </w:lvl>
+  </w:abstractNum>
+  <w:abstractNum w:abstractNumId="111114">
+    <w:lvl>
+      <w:numFmt w:val="bullet"/>
+      <w:suff w:val="tab"/>
+      <w:lvlText w:val="•"/>
+      <w:rPr>
+        <w:color w:val="3370ff"/>
+      </w:rPr>
+    </w:lvl>
+  </w:abstractNum>
+  <w:abstractNum w:abstractNumId="111115">
+    <w:lvl>
+      <w:numFmt w:val="bullet"/>
+      <w:suff w:val="tab"/>
+      <w:lvlText w:val="•"/>
+      <w:rPr>
+        <w:color w:val="3370ff"/>
+      </w:rPr>
+    </w:lvl>
+  </w:abstractNum>
+  <w:abstractNum w:abstractNumId="111116">
+    <w:lvl>
+      <w:numFmt w:val="bullet"/>
+      <w:suff w:val="tab"/>
+      <w:lvlText w:val="•"/>
+      <w:rPr>
+        <w:color w:val="3370ff"/>
+      </w:rPr>
+    </w:lvl>
+  </w:abstractNum>
+  <w:abstractNum w:abstractNumId="111117">
+    <w:lvl>
+      <w:numFmt w:val="bullet"/>
+      <w:suff w:val="tab"/>
+      <w:lvlText w:val="•"/>
+      <w:rPr>
+        <w:color w:val="3370ff"/>
+      </w:rPr>
+    </w:lvl>
+  </w:abstractNum>
+  <w:abstractNum w:abstractNumId="111118">
+    <w:lvl>
+      <w:numFmt w:val="bullet"/>
+      <w:suff w:val="tab"/>
+      <w:lvlText w:val="•"/>
+      <w:rPr>
+        <w:color w:val="3370ff"/>
+      </w:rPr>
+    </w:lvl>
+  </w:abstractNum>
+  <w:abstractNum w:abstractNumId="111119">
+    <w:lvl>
+      <w:numFmt w:val="bullet"/>
+      <w:suff w:val="tab"/>
+      <w:lvlText w:val="•"/>
+      <w:rPr>
+        <w:color w:val="3370ff"/>
+      </w:rPr>
+    </w:lvl>
+  </w:abstractNum>
+  <w:abstractNum w:abstractNumId="111120">
+    <w:lvl>
+      <w:numFmt w:val="bullet"/>
+      <w:suff w:val="tab"/>
+      <w:lvlText w:val="•"/>
+      <w:rPr>
+        <w:color w:val="3370ff"/>
+      </w:rPr>
+    </w:lvl>
+  </w:abstractNum>
+  <w:abstractNum w:abstractNumId="111121">
+    <w:lvl>
+      <w:numFmt w:val="bullet"/>
+      <w:suff w:val="tab"/>
+      <w:lvlText w:val="•"/>
+      <w:rPr>
+        <w:color w:val="3370ff"/>
+      </w:rPr>
+    </w:lvl>
+  </w:abstractNum>
+  <w:abstractNum w:abstractNumId="111122">
+    <w:lvl>
+      <w:numFmt w:val="bullet"/>
+      <w:suff w:val="tab"/>
+      <w:lvlText w:val="•"/>
+      <w:rPr>
+        <w:color w:val="3370ff"/>
+      </w:rPr>
+    </w:lvl>
+  </w:abstractNum>
+  <w:abstractNum w:abstractNumId="111123">
+    <w:lvl>
+      <w:numFmt w:val="bullet"/>
+      <w:suff w:val="tab"/>
+      <w:lvlText w:val="•"/>
+      <w:rPr>
+        <w:color w:val="3370ff"/>
+      </w:rPr>
+    </w:lvl>
+  </w:abstractNum>
+  <w:abstractNum w:abstractNumId="111124">
+    <w:lvl>
+      <w:numFmt w:val="bullet"/>
+      <w:suff w:val="tab"/>
+      <w:lvlText w:val="•"/>
+      <w:rPr>
+        <w:color w:val="3370ff"/>
+      </w:rPr>
+    </w:lvl>
+  </w:abstractNum>
+  <w:abstractNum w:abstractNumId="111125">
+    <w:lvl>
+      <w:numFmt w:val="bullet"/>
+      <w:suff w:val="tab"/>
+      <w:lvlText w:val="•"/>
+      <w:rPr>
+        <w:color w:val="3370ff"/>
+      </w:rPr>
+    </w:lvl>
+  </w:abstractNum>
+  <w:abstractNum w:abstractNumId="111126">
+    <w:lvl>
+      <w:numFmt w:val="bullet"/>
+      <w:suff w:val="tab"/>
+      <w:lvlText w:val="•"/>
+      <w:rPr>
+        <w:color w:val="3370ff"/>
+      </w:rPr>
+    </w:lvl>
+  </w:abstractNum>
+  <w:abstractNum w:abstractNumId="111127">
+    <w:lvl>
+      <w:numFmt w:val="bullet"/>
+      <w:suff w:val="tab"/>
+      <w:lvlText w:val="•"/>
+      <w:rPr>
+        <w:color w:val="3370ff"/>
+      </w:rPr>
+    </w:lvl>
+  </w:abstractNum>
+  <w:abstractNum w:abstractNumId="111128">
+    <w:lvl>
+      <w:numFmt w:val="bullet"/>
+      <w:suff w:val="tab"/>
+      <w:lvlText w:val="•"/>
+      <w:rPr>
+        <w:color w:val="3370ff"/>
+      </w:rPr>
+    </w:lvl>
+  </w:abstractNum>
+  <w:abstractNum w:abstractNumId="111129">
+    <w:lvl>
+      <w:numFmt w:val="bullet"/>
+      <w:suff w:val="tab"/>
+      <w:lvlText w:val="•"/>
+      <w:rPr>
+        <w:color w:val="3370ff"/>
+      </w:rPr>
+    </w:lvl>
+  </w:abstractNum>
+  <w:abstractNum w:abstractNumId="111130">
+    <w:lvl>
+      <w:numFmt w:val="bullet"/>
+      <w:suff w:val="tab"/>
+      <w:lvlText w:val="•"/>
+      <w:rPr>
+        <w:color w:val="3370ff"/>
+      </w:rPr>
+    </w:lvl>
+  </w:abstractNum>
+  <w:abstractNum w:abstractNumId="111131">
+    <w:lvl>
+      <w:numFmt w:val="bullet"/>
+      <w:suff w:val="tab"/>
+      <w:lvlText w:val="•"/>
+      <w:rPr>
+        <w:color w:val="3370ff"/>
+      </w:rPr>
+    </w:lvl>
+  </w:abstractNum>
+  <w:abstractNum w:abstractNumId="111132">
+    <w:lvl>
+      <w:numFmt w:val="bullet"/>
+      <w:suff w:val="tab"/>
+      <w:lvlText w:val="•"/>
+      <w:rPr>
+        <w:color w:val="3370ff"/>
+      </w:rPr>
+    </w:lvl>
+  </w:abstractNum>
+  <w:abstractNum w:abstractNumId="111133">
+    <w:lvl>
+      <w:numFmt w:val="bullet"/>
+      <w:suff w:val="tab"/>
+      <w:lvlText w:val="•"/>
+      <w:rPr>
+        <w:color w:val="3370ff"/>
+      </w:rPr>
+    </w:lvl>
+  </w:abstractNum>
+  <w:abstractNum w:abstractNumId="111134">
+    <w:lvl>
+      <w:numFmt w:val="bullet"/>
+      <w:suff w:val="tab"/>
+      <w:lvlText w:val="•"/>
+      <w:rPr>
+        <w:color w:val="3370ff"/>
+      </w:rPr>
+    </w:lvl>
+  </w:abstractNum>
+  <w:abstractNum w:abstractNumId="111135">
+    <w:lvl>
+      <w:numFmt w:val="bullet"/>
+      <w:suff w:val="tab"/>
+      <w:lvlText w:val="•"/>
+      <w:rPr>
+        <w:color w:val="3370ff"/>
+      </w:rPr>
+    </w:lvl>
+  </w:abstractNum>
+  <w:abstractNum w:abstractNumId="111136">
+    <w:lvl>
+      <w:numFmt w:val="bullet"/>
+      <w:suff w:val="tab"/>
+      <w:lvlText w:val="•"/>
+      <w:rPr>
+        <w:color w:val="3370ff"/>
+      </w:rPr>
+    </w:lvl>
+  </w:abstractNum>
+  <w:abstractNum w:abstractNumId="111137">
+    <w:lvl>
+      <w:numFmt w:val="bullet"/>
+      <w:suff w:val="tab"/>
+      <w:lvlText w:val="•"/>
+      <w:rPr>
+        <w:color w:val="3370ff"/>
+      </w:rPr>
+    </w:lvl>
+  </w:abstractNum>
+  <w:abstractNum w:abstractNumId="111138">
+    <w:lvl>
+      <w:numFmt w:val="bullet"/>
+      <w:suff w:val="tab"/>
+      <w:lvlText w:val="•"/>
+      <w:rPr>
+        <w:color w:val="3370ff"/>
+      </w:rPr>
+    </w:lvl>
+  </w:abstractNum>
+  <w:abstractNum w:abstractNumId="111139">
+    <w:lvl>
+      <w:numFmt w:val="bullet"/>
+      <w:suff w:val="tab"/>
+      <w:lvlText w:val="•"/>
+      <w:rPr>
+        <w:color w:val="3370ff"/>
+      </w:rPr>
+    </w:lvl>
+  </w:abstractNum>
+  <w:abstractNum w:abstractNumId="111140">
+    <w:lvl>
+      <w:numFmt w:val="bullet"/>
+      <w:suff w:val="tab"/>
+      <w:lvlText w:val="•"/>
+      <w:rPr>
+        <w:color w:val="3370ff"/>
+      </w:rPr>
+    </w:lvl>
+  </w:abstractNum>
+  <w:abstractNum w:abstractNumId="111141">
+    <w:lvl>
+      <w:numFmt w:val="bullet"/>
+      <w:suff w:val="tab"/>
+      <w:lvlText w:val="•"/>
+      <w:rPr>
+        <w:color w:val="3370ff"/>
+      </w:rPr>
+    </w:lvl>
+  </w:abstractNum>
+  <w:abstractNum w:abstractNumId="111142">
+    <w:lvl>
+      <w:numFmt w:val="bullet"/>
+      <w:suff w:val="tab"/>
+      <w:lvlText w:val="•"/>
+      <w:rPr>
+        <w:color w:val="3370ff"/>
+      </w:rPr>
+    </w:lvl>
+  </w:abstractNum>
+  <w:abstractNum w:abstractNumId="111143">
+    <w:lvl>
+      <w:numFmt w:val="bullet"/>
+      <w:suff w:val="tab"/>
+      <w:lvlText w:val="•"/>
+      <w:rPr>
+        <w:color w:val="3370ff"/>
+      </w:rPr>
+    </w:lvl>
+  </w:abstractNum>
+  <w:abstractNum w:abstractNumId="111144">
+    <w:lvl>
+      <w:numFmt w:val="bullet"/>
+      <w:suff w:val="tab"/>
+      <w:lvlText w:val="•"/>
+      <w:rPr>
+        <w:color w:val="3370ff"/>
+      </w:rPr>
+    </w:lvl>
+  </w:abstractNum>
+  <w:abstractNum w:abstractNumId="111145">
+    <w:lvl>
+      <w:numFmt w:val="bullet"/>
+      <w:suff w:val="tab"/>
+      <w:lvlText w:val="•"/>
+      <w:rPr>
+        <w:color w:val="3370ff"/>
+      </w:rPr>
+    </w:lvl>
+  </w:abstractNum>
+  <w:abstractNum w:abstractNumId="111146">
+    <w:lvl>
+      <w:numFmt w:val="bullet"/>
+      <w:suff w:val="tab"/>
+      <w:lvlText w:val="•"/>
+      <w:rPr>
+        <w:color w:val="3370ff"/>
+      </w:rPr>
+    </w:lvl>
+  </w:abstractNum>
+  <w:abstractNum w:abstractNumId="111147">
+    <w:lvl>
+      <w:numFmt w:val="bullet"/>
+      <w:suff w:val="tab"/>
+      <w:lvlText w:val="•"/>
+      <w:rPr>
+        <w:color w:val="3370ff"/>
+      </w:rPr>
+    </w:lvl>
+  </w:abstractNum>
+  <w:abstractNum w:abstractNumId="111148">
+    <w:lvl>
+      <w:numFmt w:val="bullet"/>
+      <w:suff w:val="tab"/>
+      <w:lvlText w:val="•"/>
+      <w:rPr>
+        <w:color w:val="3370ff"/>
+      </w:rPr>
+    </w:lvl>
+  </w:abstractNum>
+  <w:abstractNum w:abstractNumId="111149">
+    <w:lvl>
+      <w:numFmt w:val="bullet"/>
+      <w:suff w:val="tab"/>
+      <w:lvlText w:val="•"/>
+      <w:rPr>
+        <w:color w:val="3370ff"/>
+      </w:rPr>
+    </w:lvl>
+  </w:abstractNum>
+  <w:abstractNum w:abstractNumId="111150">
+    <w:lvl>
+      <w:numFmt w:val="bullet"/>
+      <w:suff w:val="tab"/>
+      <w:lvlText w:val="•"/>
+      <w:rPr>
+        <w:color w:val="3370ff"/>
+      </w:rPr>
+    </w:lvl>
+  </w:abstractNum>
+  <w:abstractNum w:abstractNumId="111151">
+    <w:lvl>
+      <w:numFmt w:val="bullet"/>
+      <w:suff w:val="tab"/>
+      <w:lvlText w:val="•"/>
+      <w:rPr>
+        <w:color w:val="3370ff"/>
+      </w:rPr>
+    </w:lvl>
+  </w:abstractNum>
+  <w:abstractNum w:abstractNumId="111152">
+    <w:lvl>
+      <w:numFmt w:val="bullet"/>
+      <w:suff w:val="tab"/>
+      <w:lvlText w:val="•"/>
+      <w:rPr>
+        <w:color w:val="3370ff"/>
+      </w:rPr>
+    </w:lvl>
+  </w:abstractNum>
+  <w:abstractNum w:abstractNumId="111153">
+    <w:lvl>
+      <w:numFmt w:val="bullet"/>
+      <w:suff w:val="tab"/>
+      <w:lvlText w:val="•"/>
+      <w:rPr>
+        <w:color w:val="3370ff"/>
+      </w:rPr>
+    </w:lvl>
+  </w:abstractNum>
+  <w:abstractNum w:abstractNumId="111154">
+    <w:lvl>
+      <w:numFmt w:val="bullet"/>
+      <w:suff w:val="tab"/>
+      <w:lvlText w:val="•"/>
+      <w:rPr>
+        <w:color w:val="3370ff"/>
+      </w:rPr>
+    </w:lvl>
+  </w:abstractNum>
+  <w:abstractNum w:abstractNumId="111155">
+    <w:lvl>
+      <w:numFmt w:val="bullet"/>
+      <w:suff w:val="tab"/>
+      <w:lvlText w:val="•"/>
+      <w:rPr>
+        <w:color w:val="3370ff"/>
+      </w:rPr>
+    </w:lvl>
+  </w:abstractNum>
+  <w:abstractNum w:abstractNumId="111156">
+    <w:lvl>
+      <w:numFmt w:val="bullet"/>
+      <w:suff w:val="tab"/>
+      <w:lvlText w:val="•"/>
+      <w:rPr>
+        <w:color w:val="3370ff"/>
+      </w:rPr>
+    </w:lvl>
+  </w:abstractNum>
+  <w:abstractNum w:abstractNumId="111157">
+    <w:lvl>
+      <w:numFmt w:val="bullet"/>
+      <w:suff w:val="tab"/>
+      <w:lvlText w:val="•"/>
+      <w:rPr>
+        <w:color w:val="3370ff"/>
+      </w:rPr>
+    </w:lvl>
+  </w:abstractNum>
+  <w:abstractNum w:abstractNumId="111158">
+    <w:lvl>
+      <w:numFmt w:val="bullet"/>
+      <w:suff w:val="tab"/>
+      <w:lvlText w:val="•"/>
+      <w:rPr>
+        <w:color w:val="3370ff"/>
+      </w:rPr>
+    </w:lvl>
+  </w:abstractNum>
+  <w:abstractNum w:abstractNumId="111159">
+    <w:lvl>
+      <w:numFmt w:val="bullet"/>
+      <w:suff w:val="tab"/>
+      <w:lvlText w:val="•"/>
+      <w:rPr>
+        <w:color w:val="3370ff"/>
+      </w:rPr>
+    </w:lvl>
+  </w:abstractNum>
+  <w:abstractNum w:abstractNumId="111160">
+    <w:lvl>
+      <w:numFmt w:val="bullet"/>
+      <w:suff w:val="tab"/>
+      <w:lvlText w:val="•"/>
+      <w:rPr>
+        <w:color w:val="3370ff"/>
+      </w:rPr>
+    </w:lvl>
+  </w:abstractNum>
+  <w:abstractNum w:abstractNumId="111161">
+    <w:lvl>
+      <w:numFmt w:val="bullet"/>
+      <w:suff w:val="tab"/>
+      <w:lvlText w:val="•"/>
+      <w:rPr>
+        <w:color w:val="3370ff"/>
+      </w:rPr>
+    </w:lvl>
+  </w:abstractNum>
+  <w:abstractNum w:abstractNumId="111162">
+    <w:lvl>
+      <w:numFmt w:val="bullet"/>
+      <w:suff w:val="tab"/>
+      <w:lvlText w:val="•"/>
+      <w:rPr>
+        <w:color w:val="3370ff"/>
+      </w:rPr>
+    </w:lvl>
+  </w:abstractNum>
+  <w:abstractNum w:abstractNumId="111163">
+    <w:lvl>
+      <w:numFmt w:val="bullet"/>
+      <w:suff w:val="tab"/>
+      <w:lvlText w:val="•"/>
+      <w:rPr>
+        <w:color w:val="3370ff"/>
+      </w:rPr>
+    </w:lvl>
+  </w:abstractNum>
+  <w:abstractNum w:abstractNumId="111164">
+    <w:lvl>
+      <w:numFmt w:val="bullet"/>
+      <w:suff w:val="tab"/>
+      <w:lvlText w:val="•"/>
+      <w:rPr>
+        <w:color w:val="3370ff"/>
+      </w:rPr>
+    </w:lvl>
+  </w:abstractNum>
+  <w:abstractNum w:abstractNumId="111165">
+    <w:lvl>
+      <w:numFmt w:val="bullet"/>
+      <w:suff w:val="tab"/>
+      <w:lvlText w:val="•"/>
+      <w:rPr>
+        <w:color w:val="3370ff"/>
+      </w:rPr>
+    </w:lvl>
+  </w:abstractNum>
+  <w:abstractNum w:abstractNumId="111166">
+    <w:lvl>
+      <w:numFmt w:val="bullet"/>
+      <w:suff w:val="tab"/>
+      <w:lvlText w:val="•"/>
+      <w:rPr>
+        <w:color w:val="3370ff"/>
+      </w:rPr>
+    </w:lvl>
+  </w:abstractNum>
+  <w:abstractNum w:abstractNumId="111167">
+    <w:lvl>
+      <w:numFmt w:val="bullet"/>
+      <w:suff w:val="tab"/>
+      <w:lvlText w:val="•"/>
+      <w:rPr>
+        <w:color w:val="3370ff"/>
+      </w:rPr>
+    </w:lvl>
+  </w:abstractNum>
+  <w:abstractNum w:abstractNumId="111168">
+    <w:lvl>
+      <w:numFmt w:val="bullet"/>
+      <w:suff w:val="tab"/>
+      <w:lvlText w:val="•"/>
+      <w:rPr>
+        <w:color w:val="3370ff"/>
+      </w:rPr>
+    </w:lvl>
+  </w:abstractNum>
+  <w:abstractNum w:abstractNumId="111169">
+    <w:lvl>
+      <w:numFmt w:val="bullet"/>
+      <w:suff w:val="tab"/>
+      <w:lvlText w:val="•"/>
+      <w:rPr>
+        <w:color w:val="3370ff"/>
+      </w:rPr>
+    </w:lvl>
+  </w:abstractNum>
+  <w:abstractNum w:abstractNumId="111170">
+    <w:lvl>
+      <w:numFmt w:val="bullet"/>
+      <w:suff w:val="tab"/>
+      <w:lvlText w:val="•"/>
+      <w:rPr>
+        <w:color w:val="3370ff"/>
+      </w:rPr>
+    </w:lvl>
+  </w:abstractNum>
+  <w:abstractNum w:abstractNumId="111171">
+    <w:lvl>
+      <w:numFmt w:val="bullet"/>
+      <w:suff w:val="tab"/>
+      <w:lvlText w:val="•"/>
+      <w:rPr>
+        <w:color w:val="3370ff"/>
+      </w:rPr>
+    </w:lvl>
+  </w:abstractNum>
+  <w:abstractNum w:abstractNumId="111172">
+    <w:lvl>
+      <w:numFmt w:val="bullet"/>
+      <w:suff w:val="tab"/>
+      <w:lvlText w:val="•"/>
+      <w:rPr>
+        <w:color w:val="3370ff"/>
+      </w:rPr>
+    </w:lvl>
+  </w:abstractNum>
+  <w:abstractNum w:abstractNumId="111173">
+    <w:lvl>
+      <w:numFmt w:val="bullet"/>
+      <w:suff w:val="tab"/>
+      <w:lvlText w:val="•"/>
+      <w:rPr>
+        <w:color w:val="3370ff"/>
+      </w:rPr>
+    </w:lvl>
+  </w:abstractNum>
+  <w:abstractNum w:abstractNumId="111174">
+    <w:lvl>
+      <w:numFmt w:val="bullet"/>
+      <w:suff w:val="tab"/>
+      <w:lvlText w:val="•"/>
+      <w:rPr>
+        <w:color w:val="3370ff"/>
+      </w:rPr>
+    </w:lvl>
+  </w:abstractNum>
+  <w:abstractNum w:abstractNumId="111175">
+    <w:lvl>
+      <w:numFmt w:val="bullet"/>
+      <w:suff w:val="tab"/>
+      <w:lvlText w:val="•"/>
+      <w:rPr>
+        <w:color w:val="3370ff"/>
+      </w:rPr>
+    </w:lvl>
+  </w:abstractNum>
+  <w:abstractNum w:abstractNumId="111176">
+    <w:lvl>
+      <w:numFmt w:val="bullet"/>
+      <w:suff w:val="tab"/>
+      <w:lvlText w:val="•"/>
+      <w:rPr>
+        <w:color w:val="3370ff"/>
+      </w:rPr>
+    </w:lvl>
+  </w:abstractNum>
+  <w:abstractNum w:abstractNumId="111177">
+    <w:lvl>
+      <w:numFmt w:val="bullet"/>
+      <w:suff w:val="tab"/>
+      <w:lvlText w:val="•"/>
+      <w:rPr>
+        <w:color w:val="3370ff"/>
+      </w:rPr>
+    </w:lvl>
+  </w:abstractNum>
+  <w:abstractNum w:abstractNumId="111178">
+    <w:lvl>
+      <w:numFmt w:val="bullet"/>
+      <w:suff w:val="tab"/>
+      <w:lvlText w:val="•"/>
+      <w:rPr>
+        <w:color w:val="3370ff"/>
+      </w:rPr>
+    </w:lvl>
+  </w:abstractNum>
+  <w:abstractNum w:abstractNumId="111179">
+    <w:lvl>
+      <w:numFmt w:val="bullet"/>
+      <w:suff w:val="tab"/>
+      <w:lvlText w:val="•"/>
+      <w:rPr>
+        <w:color w:val="3370ff"/>
+      </w:rPr>
+    </w:lvl>
+  </w:abstractNum>
+  <w:abstractNum w:abstractNumId="111180">
+    <w:lvl>
+      <w:numFmt w:val="bullet"/>
+      <w:suff w:val="tab"/>
+      <w:lvlText w:val="•"/>
+      <w:rPr>
+        <w:color w:val="3370ff"/>
+      </w:rPr>
+    </w:lvl>
+  </w:abstractNum>
+  <w:abstractNum w:abstractNumId="111181">
+    <w:lvl>
+      <w:numFmt w:val="bullet"/>
+      <w:suff w:val="tab"/>
+      <w:lvlText w:val="•"/>
+      <w:rPr>
+        <w:color w:val="3370ff"/>
+      </w:rPr>
+    </w:lvl>
+  </w:abstractNum>
+  <w:abstractNum w:abstractNumId="111182">
+    <w:lvl>
+      <w:numFmt w:val="bullet"/>
+      <w:suff w:val="tab"/>
+      <w:lvlText w:val="•"/>
+      <w:rPr>
+        <w:color w:val="3370ff"/>
+      </w:rPr>
+    </w:lvl>
+  </w:abstractNum>
+  <w:abstractNum w:abstractNumId="111183">
+    <w:lvl>
+      <w:numFmt w:val="bullet"/>
+      <w:suff w:val="tab"/>
+      <w:lvlText w:val="•"/>
+      <w:rPr>
+        <w:color w:val="3370ff"/>
+      </w:rPr>
+    </w:lvl>
+  </w:abstractNum>
+  <w:abstractNum w:abstractNumId="111184">
+    <w:lvl>
+      <w:numFmt w:val="bullet"/>
+      <w:suff w:val="tab"/>
+      <w:lvlText w:val="•"/>
+      <w:rPr>
+        <w:color w:val="3370ff"/>
+      </w:rPr>
+    </w:lvl>
+  </w:abstractNum>
+  <w:abstractNum w:abstractNumId="111185">
+    <w:lvl>
+      <w:numFmt w:val="bullet"/>
+      <w:suff w:val="tab"/>
+      <w:lvlText w:val="•"/>
+      <w:rPr>
+        <w:color w:val="3370ff"/>
+      </w:rPr>
+    </w:lvl>
+  </w:abstractNum>
+  <w:abstractNum w:abstractNumId="111186">
+    <w:lvl>
+      <w:numFmt w:val="bullet"/>
+      <w:suff w:val="tab"/>
+      <w:lvlText w:val="•"/>
+      <w:rPr>
+        <w:color w:val="3370ff"/>
+      </w:rPr>
+    </w:lvl>
+  </w:abstractNum>
+  <w:abstractNum w:abstractNumId="111187">
+    <w:lvl>
+      <w:numFmt w:val="bullet"/>
+      <w:suff w:val="tab"/>
+      <w:lvlText w:val="•"/>
+      <w:rPr>
+        <w:color w:val="3370ff"/>
+      </w:rPr>
+    </w:lvl>
+  </w:abstractNum>
+  <w:abstractNum w:abstractNumId="111188">
+    <w:lvl>
+      <w:numFmt w:val="bullet"/>
+      <w:suff w:val="tab"/>
+      <w:lvlText w:val="•"/>
+      <w:rPr>
+        <w:color w:val="3370ff"/>
+      </w:rPr>
+    </w:lvl>
+  </w:abstractNum>
+  <w:abstractNum w:abstractNumId="111189">
+    <w:lvl>
+      <w:numFmt w:val="bullet"/>
+      <w:suff w:val="tab"/>
+      <w:lvlText w:val="•"/>
+      <w:rPr>
+        <w:color w:val="3370ff"/>
+      </w:rPr>
+    </w:lvl>
+  </w:abstractNum>
+  <w:abstractNum w:abstractNumId="111190">
+    <w:lvl>
+      <w:numFmt w:val="bullet"/>
+      <w:suff w:val="tab"/>
+      <w:lvlText w:val="•"/>
+      <w:rPr>
+        <w:color w:val="3370ff"/>
+      </w:rPr>
+    </w:lvl>
+  </w:abstractNum>
+  <w:abstractNum w:abstractNumId="111191">
+    <w:lvl>
+      <w:numFmt w:val="bullet"/>
+      <w:suff w:val="tab"/>
+      <w:lvlText w:val="•"/>
+      <w:rPr>
+        <w:color w:val="3370ff"/>
+      </w:rPr>
+    </w:lvl>
+  </w:abstractNum>
+  <w:abstractNum w:abstractNumId="111192">
+    <w:lvl>
+      <w:numFmt w:val="bullet"/>
+      <w:suff w:val="tab"/>
+      <w:lvlText w:val="•"/>
+      <w:rPr>
+        <w:color w:val="3370ff"/>
+      </w:rPr>
+    </w:lvl>
+  </w:abstractNum>
+  <w:abstractNum w:abstractNumId="111193">
+    <w:lvl>
+      <w:numFmt w:val="bullet"/>
+      <w:suff w:val="tab"/>
+      <w:lvlText w:val="•"/>
+      <w:rPr>
+        <w:color w:val="3370ff"/>
+      </w:rPr>
+    </w:lvl>
+  </w:abstractNum>
+  <w:abstractNum w:abstractNumId="111194">
+    <w:lvl>
+      <w:numFmt w:val="bullet"/>
+      <w:suff w:val="tab"/>
+      <w:lvlText w:val="•"/>
+      <w:rPr>
+        <w:color w:val="3370ff"/>
+      </w:rPr>
+    </w:lvl>
+  </w:abstractNum>
+  <w:abstractNum w:abstractNumId="111195">
+    <w:lvl>
+      <w:numFmt w:val="bullet"/>
+      <w:suff w:val="tab"/>
+      <w:lvlText w:val="•"/>
+      <w:rPr>
+        <w:color w:val="3370ff"/>
+      </w:rPr>
+    </w:lvl>
+  </w:abstractNum>
+  <w:abstractNum w:abstractNumId="111196">
+    <w:lvl>
+      <w:numFmt w:val="bullet"/>
+      <w:suff w:val="tab"/>
+      <w:lvlText w:val="•"/>
+      <w:rPr>
+        <w:color w:val="3370ff"/>
+      </w:rPr>
+    </w:lvl>
+  </w:abstractNum>
+  <w:abstractNum w:abstractNumId="111197">
+    <w:lvl>
+      <w:numFmt w:val="bullet"/>
+      <w:suff w:val="tab"/>
+      <w:lvlText w:val="•"/>
+      <w:rPr>
+        <w:color w:val="3370ff"/>
+      </w:rPr>
+    </w:lvl>
+  </w:abstractNum>
+  <w:abstractNum w:abstractNumId="111198">
+    <w:lvl>
+      <w:numFmt w:val="bullet"/>
+      <w:suff w:val="tab"/>
+      <w:lvlText w:val="•"/>
+      <w:rPr>
+        <w:color w:val="3370ff"/>
+      </w:rPr>
+    </w:lvl>
+  </w:abstractNum>
+  <w:abstractNum w:abstractNumId="111199">
+    <w:lvl>
+      <w:numFmt w:val="bullet"/>
+      <w:suff w:val="tab"/>
+      <w:lvlText w:val="•"/>
+      <w:rPr>
+        <w:color w:val="3370ff"/>
+      </w:rPr>
+    </w:lvl>
+  </w:abstractNum>
+  <w:abstractNum w:abstractNumId="111200">
+    <w:lvl>
+      <w:numFmt w:val="bullet"/>
+      <w:suff w:val="tab"/>
+      <w:lvlText w:val="•"/>
+      <w:rPr>
+        <w:color w:val="3370ff"/>
+      </w:rPr>
+    </w:lvl>
+  </w:abstractNum>
+  <w:abstractNum w:abstractNumId="111201">
+    <w:lvl>
+      <w:numFmt w:val="bullet"/>
+      <w:suff w:val="tab"/>
+      <w:lvlText w:val="•"/>
+      <w:rPr>
+        <w:color w:val="3370ff"/>
+      </w:rPr>
+    </w:lvl>
+  </w:abstractNum>
+  <w:abstractNum w:abstractNumId="111202">
+    <w:lvl>
+      <w:numFmt w:val="bullet"/>
+      <w:suff w:val="tab"/>
+      <w:lvlText w:val="•"/>
+      <w:rPr>
+        <w:color w:val="3370ff"/>
+      </w:rPr>
+    </w:lvl>
+  </w:abstractNum>
+  <w:abstractNum w:abstractNumId="111203">
+    <w:lvl>
+      <w:numFmt w:val="bullet"/>
+      <w:suff w:val="tab"/>
+      <w:lvlText w:val="•"/>
+      <w:rPr>
+        <w:color w:val="3370ff"/>
+      </w:rPr>
+    </w:lvl>
+  </w:abstractNum>
+  <w:abstractNum w:abstractNumId="111204">
+    <w:lvl>
+      <w:numFmt w:val="bullet"/>
+      <w:suff w:val="tab"/>
+      <w:lvlText w:val="•"/>
+      <w:rPr>
+        <w:color w:val="3370ff"/>
+      </w:rPr>
+    </w:lvl>
+  </w:abstractNum>
+  <w:abstractNum w:abstractNumId="111205">
+    <w:lvl>
+      <w:numFmt w:val="bullet"/>
+      <w:suff w:val="tab"/>
+      <w:lvlText w:val="•"/>
+      <w:rPr>
+        <w:color w:val="3370ff"/>
+      </w:rPr>
+    </w:lvl>
+  </w:abstractNum>
+  <w:abstractNum w:abstractNumId="111206">
+    <w:lvl>
+      <w:numFmt w:val="bullet"/>
+      <w:suff w:val="tab"/>
+      <w:lvlText w:val="•"/>
+      <w:rPr>
+        <w:color w:val="3370ff"/>
+      </w:rPr>
+    </w:lvl>
+  </w:abstractNum>
+  <w:abstractNum w:abstractNumId="111207">
+    <w:lvl>
+      <w:numFmt w:val="bullet"/>
+      <w:suff w:val="tab"/>
+      <w:lvlText w:val="•"/>
+      <w:rPr>
+        <w:color w:val="3370ff"/>
+      </w:rPr>
+    </w:lvl>
+  </w:abstractNum>
+  <w:abstractNum w:abstractNumId="111208">
+    <w:lvl>
+      <w:numFmt w:val="bullet"/>
+      <w:suff w:val="tab"/>
+      <w:lvlText w:val="•"/>
+      <w:rPr>
+        <w:color w:val="3370ff"/>
+      </w:rPr>
+    </w:lvl>
+  </w:abstractNum>
+  <w:abstractNum w:abstractNumId="111209">
+    <w:lvl>
+      <w:numFmt w:val="bullet"/>
+      <w:suff w:val="tab"/>
+      <w:lvlText w:val="•"/>
+      <w:rPr>
+        <w:color w:val="3370ff"/>
+      </w:rPr>
+    </w:lvl>
+  </w:abstractNum>
+  <w:abstractNum w:abstractNumId="111210">
+    <w:lvl>
+      <w:numFmt w:val="bullet"/>
+      <w:suff w:val="tab"/>
+      <w:lvlText w:val="•"/>
+      <w:rPr>
+        <w:color w:val="3370ff"/>
+      </w:rPr>
+    </w:lvl>
+  </w:abstractNum>
+  <w:abstractNum w:abstractNumId="111211">
+    <w:lvl>
+      <w:numFmt w:val="bullet"/>
+      <w:suff w:val="tab"/>
+      <w:lvlText w:val="•"/>
+      <w:rPr>
+        <w:color w:val="3370ff"/>
+      </w:rPr>
+    </w:lvl>
+  </w:abstractNum>
+  <w:abstractNum w:abstractNumId="111212">
+    <w:lvl>
+      <w:numFmt w:val="bullet"/>
+      <w:suff w:val="tab"/>
+      <w:lvlText w:val="•"/>
+      <w:rPr>
+        <w:color w:val="3370ff"/>
+      </w:rPr>
+    </w:lvl>
+  </w:abstractNum>
+  <w:abstractNum w:abstractNumId="111213">
+    <w:lvl>
+      <w:numFmt w:val="bullet"/>
+      <w:suff w:val="tab"/>
+      <w:lvlText w:val="•"/>
+      <w:rPr>
+        <w:color w:val="3370ff"/>
+      </w:rPr>
+    </w:lvl>
+  </w:abstractNum>
+  <w:abstractNum w:abstractNumId="111214">
+    <w:lvl>
+      <w:numFmt w:val="bullet"/>
+      <w:suff w:val="tab"/>
+      <w:lvlText w:val="•"/>
+      <w:rPr>
+        <w:color w:val="3370ff"/>
+      </w:rPr>
+    </w:lvl>
+  </w:abstractNum>
+  <w:abstractNum w:abstractNumId="111215">
+    <w:lvl>
+      <w:numFmt w:val="bullet"/>
+      <w:suff w:val="tab"/>
+      <w:lvlText w:val="•"/>
+      <w:rPr>
+        <w:color w:val="3370ff"/>
+      </w:rPr>
+    </w:lvl>
+  </w:abstractNum>
+  <w:abstractNum w:abstractNumId="111216">
+    <w:lvl>
+      <w:numFmt w:val="bullet"/>
+      <w:suff w:val="tab"/>
+      <w:lvlText w:val="•"/>
+      <w:rPr>
+        <w:color w:val="3370ff"/>
+      </w:rPr>
+    </w:lvl>
+  </w:abstractNum>
+  <w:abstractNum w:abstractNumId="111217">
+    <w:lvl>
+      <w:numFmt w:val="bullet"/>
+      <w:suff w:val="tab"/>
+      <w:lvlText w:val="•"/>
+      <w:rPr>
+        <w:color w:val="3370ff"/>
+      </w:rPr>
+    </w:lvl>
+  </w:abstractNum>
+  <w:abstractNum w:abstractNumId="111218">
+    <w:lvl>
+      <w:numFmt w:val="bullet"/>
+      <w:suff w:val="tab"/>
+      <w:lvlText w:val="•"/>
+      <w:rPr>
+        <w:color w:val="3370ff"/>
+      </w:rPr>
+    </w:lvl>
+  </w:abstractNum>
+  <w:abstractNum w:abstractNumId="111219">
+    <w:lvl>
+      <w:numFmt w:val="bullet"/>
+      <w:suff w:val="tab"/>
+      <w:lvlText w:val="•"/>
+      <w:rPr>
+        <w:color w:val="3370ff"/>
+      </w:rPr>
+    </w:lvl>
+  </w:abstractNum>
+  <w:abstractNum w:abstractNumId="111220">
+    <w:lvl>
+      <w:numFmt w:val="bullet"/>
+      <w:suff w:val="tab"/>
+      <w:lvlText w:val="•"/>
+      <w:rPr>
+        <w:color w:val="3370ff"/>
+      </w:rPr>
+    </w:lvl>
+  </w:abstractNum>
+  <w:abstractNum w:abstractNumId="111221">
+    <w:lvl>
+      <w:numFmt w:val="bullet"/>
+      <w:suff w:val="tab"/>
+      <w:lvlText w:val="•"/>
+      <w:rPr>
+        <w:color w:val="3370ff"/>
+      </w:rPr>
+    </w:lvl>
+  </w:abstractNum>
+  <w:abstractNum w:abstractNumId="111222">
+    <w:lvl>
+      <w:numFmt w:val="bullet"/>
+      <w:suff w:val="tab"/>
+      <w:lvlText w:val="•"/>
+      <w:rPr>
+        <w:color w:val="3370ff"/>
+      </w:rPr>
+    </w:lvl>
+  </w:abstractNum>
+  <w:abstractNum w:abstractNumId="111223">
+    <w:lvl>
+      <w:numFmt w:val="bullet"/>
+      <w:suff w:val="tab"/>
+      <w:lvlText w:val="•"/>
+      <w:rPr>
+        <w:color w:val="3370ff"/>
+      </w:rPr>
+    </w:lvl>
+  </w:abstractNum>
+  <w:abstractNum w:abstractNumId="111224">
+    <w:lvl>
+      <w:numFmt w:val="bullet"/>
+      <w:suff w:val="tab"/>
+      <w:lvlText w:val="•"/>
+      <w:rPr>
+        <w:color w:val="3370ff"/>
+      </w:rPr>
+    </w:lvl>
+  </w:abstractNum>
+  <w:abstractNum w:abstractNumId="111225">
+    <w:lvl>
+      <w:numFmt w:val="bullet"/>
+      <w:suff w:val="tab"/>
+      <w:lvlText w:val="•"/>
+      <w:rPr>
+        <w:color w:val="3370ff"/>
+      </w:rPr>
+    </w:lvl>
+  </w:abstractNum>
+  <w:abstractNum w:abstractNumId="111226">
+    <w:lvl>
+      <w:numFmt w:val="bullet"/>
+      <w:suff w:val="tab"/>
+      <w:lvlText w:val="•"/>
+      <w:rPr>
+        <w:color w:val="3370ff"/>
+      </w:rPr>
+    </w:lvl>
+  </w:abstractNum>
+  <w:abstractNum w:abstractNumId="111227">
+    <w:lvl>
+      <w:numFmt w:val="bullet"/>
+      <w:suff w:val="tab"/>
+      <w:lvlText w:val="•"/>
+      <w:rPr>
+        <w:color w:val="3370ff"/>
+      </w:rPr>
+    </w:lvl>
+  </w:abstractNum>
+  <w:abstractNum w:abstractNumId="111228">
+    <w:lvl>
+      <w:numFmt w:val="bullet"/>
+      <w:suff w:val="tab"/>
+      <w:lvlText w:val="•"/>
+      <w:rPr>
+        <w:color w:val="3370ff"/>
+      </w:rPr>
+    </w:lvl>
+  </w:abstractNum>
+  <w:abstractNum w:abstractNumId="111229">
+    <w:lvl>
+      <w:numFmt w:val="bullet"/>
+      <w:suff w:val="tab"/>
+      <w:lvlText w:val="•"/>
+      <w:rPr>
+        <w:color w:val="3370ff"/>
+      </w:rPr>
+    </w:lvl>
+  </w:abstractNum>
+  <w:abstractNum w:abstractNumId="111230">
+    <w:lvl>
+      <w:numFmt w:val="bullet"/>
+      <w:suff w:val="tab"/>
+      <w:lvlText w:val="•"/>
+      <w:rPr>
+        <w:color w:val="3370ff"/>
+      </w:rPr>
+    </w:lvl>
+  </w:abstractNum>
+  <w:abstractNum w:abstractNumId="111231">
+    <w:lvl>
+      <w:numFmt w:val="bullet"/>
+      <w:suff w:val="tab"/>
+      <w:lvlText w:val="•"/>
+      <w:rPr>
+        <w:color w:val="3370ff"/>
+      </w:rPr>
+    </w:lvl>
+  </w:abstractNum>
+  <w:abstractNum w:abstractNumId="111232">
+    <w:lvl>
+      <w:numFmt w:val="bullet"/>
+      <w:suff w:val="tab"/>
+      <w:lvlText w:val="•"/>
+      <w:rPr>
+        <w:color w:val="3370ff"/>
+      </w:rPr>
+    </w:lvl>
+  </w:abstractNum>
+  <w:abstractNum w:abstractNumId="111233">
+    <w:lvl>
+      <w:numFmt w:val="bullet"/>
+      <w:suff w:val="tab"/>
+      <w:lvlText w:val="•"/>
+      <w:rPr>
+        <w:color w:val="3370ff"/>
+      </w:rPr>
+    </w:lvl>
+  </w:abstractNum>
+  <w:abstractNum w:abstractNumId="111234">
+    <w:lvl>
+      <w:numFmt w:val="bullet"/>
+      <w:suff w:val="tab"/>
+      <w:lvlText w:val="•"/>
+      <w:rPr>
+        <w:color w:val="3370ff"/>
+      </w:rPr>
+    </w:lvl>
+  </w:abstractNum>
+  <w:abstractNum w:abstractNumId="111235">
+    <w:lvl>
+      <w:numFmt w:val="bullet"/>
+      <w:suff w:val="tab"/>
+      <w:lvlText w:val="•"/>
+      <w:rPr>
+        <w:color w:val="3370ff"/>
+      </w:rPr>
+    </w:lvl>
+  </w:abstractNum>
+  <w:abstractNum w:abstractNumId="111236">
+    <w:lvl>
+      <w:numFmt w:val="bullet"/>
+      <w:suff w:val="tab"/>
+      <w:lvlText w:val="•"/>
+      <w:rPr>
+        <w:color w:val="3370ff"/>
+      </w:rPr>
+    </w:lvl>
+  </w:abstractNum>
+  <w:abstractNum w:abstractNumId="111237">
+    <w:lvl>
+      <w:numFmt w:val="bullet"/>
+      <w:suff w:val="tab"/>
+      <w:lvlText w:val="•"/>
+      <w:rPr>
+        <w:color w:val="3370ff"/>
+      </w:rPr>
+    </w:lvl>
+  </w:abstractNum>
+  <w:abstractNum w:abstractNumId="111238">
+    <w:lvl>
+      <w:numFmt w:val="bullet"/>
+      <w:suff w:val="tab"/>
+      <w:lvlText w:val="•"/>
+      <w:rPr>
+        <w:color w:val="3370ff"/>
+      </w:rPr>
+    </w:lvl>
+  </w:abstractNum>
+  <w:abstractNum w:abstractNumId="111239">
+    <w:lvl>
+      <w:numFmt w:val="bullet"/>
+      <w:suff w:val="tab"/>
+      <w:lvlText w:val="•"/>
+      <w:rPr>
+        <w:color w:val="3370ff"/>
+      </w:rPr>
+    </w:lvl>
+  </w:abstractNum>
+  <w:abstractNum w:abstractNumId="111240">
+    <w:lvl>
+      <w:numFmt w:val="bullet"/>
+      <w:suff w:val="tab"/>
+      <w:lvlText w:val="•"/>
+      <w:rPr>
+        <w:color w:val="3370ff"/>
+      </w:rPr>
+    </w:lvl>
+  </w:abstractNum>
+  <w:abstractNum w:abstractNumId="111241">
+    <w:lvl>
+      <w:numFmt w:val="bullet"/>
+      <w:suff w:val="tab"/>
+      <w:lvlText w:val="•"/>
+      <w:rPr>
+        <w:color w:val="3370ff"/>
+      </w:rPr>
+    </w:lvl>
+  </w:abstractNum>
+  <w:abstractNum w:abstractNumId="111242">
+    <w:lvl>
+      <w:numFmt w:val="bullet"/>
+      <w:suff w:val="tab"/>
+      <w:lvlText w:val="•"/>
+      <w:rPr>
+        <w:color w:val="3370ff"/>
+      </w:rPr>
+    </w:lvl>
+  </w:abstractNum>
+  <w:abstractNum w:abstractNumId="111243">
+    <w:lvl>
+      <w:numFmt w:val="bullet"/>
+      <w:suff w:val="tab"/>
+      <w:lvlText w:val="•"/>
+      <w:rPr>
+        <w:color w:val="3370ff"/>
+      </w:rPr>
+    </w:lvl>
+  </w:abstractNum>
+  <w:abstractNum w:abstractNumId="111244">
     <w:lvl>
       <w:numFmt w:val="bullet"/>
       <w:suff w:val="tab"/>
@@ -9131,7 +9131,7 @@
       </w:rPr>
     </w:lvl>
   </w:abstractNum>
-  <w:abstractNum w:abstractNumId="2747854">
+  <w:abstractNum w:abstractNumId="111245">
     <w:lvl>
       <w:numFmt w:val="bullet"/>
       <w:suff w:val="tab"/>
@@ -9141,7 +9141,7 @@
       </w:rPr>
     </w:lvl>
   </w:abstractNum>
-  <w:abstractNum w:abstractNumId="2747855">
+  <w:abstractNum w:abstractNumId="111246">
     <w:lvl>
       <w:numFmt w:val="bullet"/>
       <w:suff w:val="tab"/>
@@ -9151,7 +9151,7 @@
       </w:rPr>
     </w:lvl>
   </w:abstractNum>
-  <w:abstractNum w:abstractNumId="2747856">
+  <w:abstractNum w:abstractNumId="111247">
     <w:lvl>
       <w:numFmt w:val="bullet"/>
       <w:suff w:val="tab"/>
@@ -9161,7 +9161,7 @@
       </w:rPr>
     </w:lvl>
   </w:abstractNum>
-  <w:abstractNum w:abstractNumId="2747857">
+  <w:abstractNum w:abstractNumId="111248">
     <w:lvl>
       <w:numFmt w:val="bullet"/>
       <w:suff w:val="tab"/>
@@ -9171,97 +9171,97 @@
       </w:rPr>
     </w:lvl>
   </w:abstractNum>
-  <w:abstractNum w:abstractNumId="2747858">
-    <w:lvl>
-      <w:numFmt w:val="bullet"/>
-      <w:suff w:val="tab"/>
-      <w:lvlText w:val="•"/>
-      <w:rPr>
-        <w:color w:val="3370ff"/>
-      </w:rPr>
-    </w:lvl>
-  </w:abstractNum>
-  <w:abstractNum w:abstractNumId="2747859">
-    <w:lvl>
-      <w:numFmt w:val="bullet"/>
-      <w:suff w:val="tab"/>
-      <w:lvlText w:val="•"/>
-      <w:rPr>
-        <w:color w:val="3370ff"/>
-      </w:rPr>
-    </w:lvl>
-  </w:abstractNum>
-  <w:abstractNum w:abstractNumId="2747860">
-    <w:lvl>
-      <w:numFmt w:val="bullet"/>
-      <w:suff w:val="tab"/>
-      <w:lvlText w:val="•"/>
-      <w:rPr>
-        <w:color w:val="3370ff"/>
-      </w:rPr>
-    </w:lvl>
-  </w:abstractNum>
-  <w:abstractNum w:abstractNumId="2747861">
-    <w:lvl>
-      <w:numFmt w:val="bullet"/>
-      <w:suff w:val="tab"/>
-      <w:lvlText w:val="•"/>
-      <w:rPr>
-        <w:color w:val="3370ff"/>
-      </w:rPr>
-    </w:lvl>
-  </w:abstractNum>
-  <w:abstractNum w:abstractNumId="2747862">
-    <w:lvl>
-      <w:numFmt w:val="bullet"/>
-      <w:suff w:val="tab"/>
-      <w:lvlText w:val="•"/>
-      <w:rPr>
-        <w:color w:val="3370ff"/>
-      </w:rPr>
-    </w:lvl>
-  </w:abstractNum>
-  <w:abstractNum w:abstractNumId="2747863">
-    <w:lvl>
-      <w:numFmt w:val="bullet"/>
-      <w:suff w:val="tab"/>
-      <w:lvlText w:val="•"/>
-      <w:rPr>
-        <w:color w:val="3370ff"/>
-      </w:rPr>
-    </w:lvl>
-  </w:abstractNum>
-  <w:abstractNum w:abstractNumId="2747864">
-    <w:lvl>
-      <w:numFmt w:val="bullet"/>
-      <w:suff w:val="tab"/>
-      <w:lvlText w:val="•"/>
-      <w:rPr>
-        <w:color w:val="3370ff"/>
-      </w:rPr>
-    </w:lvl>
-  </w:abstractNum>
-  <w:abstractNum w:abstractNumId="2747865">
-    <w:lvl>
-      <w:numFmt w:val="bullet"/>
-      <w:suff w:val="tab"/>
-      <w:lvlText w:val="•"/>
-      <w:rPr>
-        <w:color w:val="3370ff"/>
-      </w:rPr>
-    </w:lvl>
-  </w:abstractNum>
-  <w:abstractNum w:abstractNumId="2747866">
-    <w:lvl>
-      <w:numFmt w:val="bullet"/>
-      <w:suff w:val="tab"/>
-      <w:lvlText w:val="•"/>
-      <w:rPr>
-        <w:color w:val="3370ff"/>
-      </w:rPr>
-    </w:lvl>
-  </w:abstractNum>
-  <w:abstractNum w:abstractNumId="2747867">
+  <w:abstractNum w:abstractNumId="111249">
+    <w:lvl>
+      <w:numFmt w:val="bullet"/>
+      <w:suff w:val="tab"/>
+      <w:lvlText w:val="•"/>
+      <w:rPr>
+        <w:color w:val="3370ff"/>
+      </w:rPr>
+    </w:lvl>
+  </w:abstractNum>
+  <w:abstractNum w:abstractNumId="111250">
+    <w:lvl>
+      <w:numFmt w:val="bullet"/>
+      <w:suff w:val="tab"/>
+      <w:lvlText w:val="•"/>
+      <w:rPr>
+        <w:color w:val="3370ff"/>
+      </w:rPr>
+    </w:lvl>
+  </w:abstractNum>
+  <w:abstractNum w:abstractNumId="111251">
+    <w:lvl>
+      <w:numFmt w:val="bullet"/>
+      <w:suff w:val="tab"/>
+      <w:lvlText w:val="•"/>
+      <w:rPr>
+        <w:color w:val="3370ff"/>
+      </w:rPr>
+    </w:lvl>
+  </w:abstractNum>
+  <w:abstractNum w:abstractNumId="111252">
+    <w:lvl>
+      <w:numFmt w:val="bullet"/>
+      <w:suff w:val="tab"/>
+      <w:lvlText w:val="•"/>
+      <w:rPr>
+        <w:color w:val="3370ff"/>
+      </w:rPr>
+    </w:lvl>
+  </w:abstractNum>
+  <w:abstractNum w:abstractNumId="111253">
+    <w:lvl>
+      <w:numFmt w:val="bullet"/>
+      <w:suff w:val="tab"/>
+      <w:lvlText w:val="•"/>
+      <w:rPr>
+        <w:color w:val="3370ff"/>
+      </w:rPr>
+    </w:lvl>
+  </w:abstractNum>
+  <w:abstractNum w:abstractNumId="111254">
+    <w:lvl>
+      <w:numFmt w:val="bullet"/>
+      <w:suff w:val="tab"/>
+      <w:lvlText w:val="•"/>
+      <w:rPr>
+        <w:color w:val="3370ff"/>
+      </w:rPr>
+    </w:lvl>
+  </w:abstractNum>
+  <w:abstractNum w:abstractNumId="111255">
+    <w:lvl>
+      <w:numFmt w:val="bullet"/>
+      <w:suff w:val="tab"/>
+      <w:lvlText w:val="•"/>
+      <w:rPr>
+        <w:color w:val="3370ff"/>
+      </w:rPr>
+    </w:lvl>
+  </w:abstractNum>
+  <w:abstractNum w:abstractNumId="111256">
+    <w:lvl>
+      <w:numFmt w:val="bullet"/>
+      <w:suff w:val="tab"/>
+      <w:lvlText w:val="•"/>
+      <w:rPr>
+        <w:color w:val="3370ff"/>
+      </w:rPr>
+    </w:lvl>
+  </w:abstractNum>
+  <w:abstractNum w:abstractNumId="111257">
+    <w:lvl>
+      <w:numFmt w:val="bullet"/>
+      <w:suff w:val="tab"/>
+      <w:lvlText w:val="•"/>
+      <w:rPr>
+        <w:color w:val="3370ff"/>
+      </w:rPr>
+    </w:lvl>
+  </w:abstractNum>
+  <w:abstractNum w:abstractNumId="111258">
     <w:lvl>
       <w:numFmt w:val="bullet"/>
       <w:suff w:val="tab"/>
@@ -9271,7 +9271,7 @@
       </w:rPr>
     </w:lvl>
   </w:abstractNum>
-  <w:abstractNum w:abstractNumId="2747868">
+  <w:abstractNum w:abstractNumId="111259">
     <w:lvl>
       <w:numFmt w:val="bullet"/>
       <w:suff w:val="tab"/>
@@ -9281,7 +9281,7 @@
       </w:rPr>
     </w:lvl>
   </w:abstractNum>
-  <w:abstractNum w:abstractNumId="2747869">
+  <w:abstractNum w:abstractNumId="111260">
     <w:lvl>
       <w:numFmt w:val="bullet"/>
       <w:suff w:val="tab"/>
@@ -9291,7 +9291,7 @@
       </w:rPr>
     </w:lvl>
   </w:abstractNum>
-  <w:abstractNum w:abstractNumId="2747870">
+  <w:abstractNum w:abstractNumId="111261">
     <w:lvl>
       <w:numFmt w:val="bullet"/>
       <w:suff w:val="tab"/>
@@ -9301,7 +9301,7 @@
       </w:rPr>
     </w:lvl>
   </w:abstractNum>
-  <w:abstractNum w:abstractNumId="2747871">
+  <w:abstractNum w:abstractNumId="111262">
     <w:lvl>
       <w:numFmt w:val="bullet"/>
       <w:suff w:val="tab"/>
@@ -9311,7 +9311,7 @@
       </w:rPr>
     </w:lvl>
   </w:abstractNum>
-  <w:abstractNum w:abstractNumId="2747872">
+  <w:abstractNum w:abstractNumId="111263">
     <w:lvl>
       <w:numFmt w:val="bullet"/>
       <w:suff w:val="tab"/>
@@ -9321,7 +9321,7 @@
       </w:rPr>
     </w:lvl>
   </w:abstractNum>
-  <w:abstractNum w:abstractNumId="2747873">
+  <w:abstractNum w:abstractNumId="111264">
     <w:lvl>
       <w:numFmt w:val="bullet"/>
       <w:suff w:val="tab"/>
@@ -9331,7 +9331,7 @@
       </w:rPr>
     </w:lvl>
   </w:abstractNum>
-  <w:abstractNum w:abstractNumId="2747874">
+  <w:abstractNum w:abstractNumId="111265">
     <w:lvl>
       <w:numFmt w:val="bullet"/>
       <w:suff w:val="tab"/>
@@ -9342,550 +9342,550 @@
     </w:lvl>
   </w:abstractNum>
   <w:num w:numId="1">
-    <w:abstractNumId w:val="2747693"/>
+    <w:abstractNumId w:val="111084"/>
   </w:num>
   <w:num w:numId="2">
-    <w:abstractNumId w:val="2747694"/>
+    <w:abstractNumId w:val="111085"/>
   </w:num>
   <w:num w:numId="3">
-    <w:abstractNumId w:val="2747695"/>
+    <w:abstractNumId w:val="111086"/>
   </w:num>
   <w:num w:numId="4">
-    <w:abstractNumId w:val="2747696"/>
+    <w:abstractNumId w:val="111087"/>
   </w:num>
   <w:num w:numId="5">
-    <w:abstractNumId w:val="2747697"/>
+    <w:abstractNumId w:val="111088"/>
   </w:num>
   <w:num w:numId="6">
-    <w:abstractNumId w:val="2747698"/>
+    <w:abstractNumId w:val="111089"/>
   </w:num>
   <w:num w:numId="7">
-    <w:abstractNumId w:val="2747699"/>
+    <w:abstractNumId w:val="111090"/>
   </w:num>
   <w:num w:numId="8">
-    <w:abstractNumId w:val="2747700"/>
+    <w:abstractNumId w:val="111091"/>
   </w:num>
   <w:num w:numId="9">
-    <w:abstractNumId w:val="2747701"/>
+    <w:abstractNumId w:val="111092"/>
   </w:num>
   <w:num w:numId="10">
-    <w:abstractNumId w:val="2747702"/>
+    <w:abstractNumId w:val="111093"/>
   </w:num>
   <w:num w:numId="11">
-    <w:abstractNumId w:val="2747703"/>
+    <w:abstractNumId w:val="111094"/>
   </w:num>
   <w:num w:numId="12">
-    <w:abstractNumId w:val="2747704"/>
+    <w:abstractNumId w:val="111095"/>
   </w:num>
   <w:num w:numId="13">
-    <w:abstractNumId w:val="2747705"/>
+    <w:abstractNumId w:val="111096"/>
   </w:num>
   <w:num w:numId="14">
-    <w:abstractNumId w:val="2747706"/>
+    <w:abstractNumId w:val="111097"/>
   </w:num>
   <w:num w:numId="15">
-    <w:abstractNumId w:val="2747707"/>
+    <w:abstractNumId w:val="111098"/>
   </w:num>
   <w:num w:numId="16">
-    <w:abstractNumId w:val="2747708"/>
+    <w:abstractNumId w:val="111099"/>
   </w:num>
   <w:num w:numId="17">
-    <w:abstractNumId w:val="2747709"/>
+    <w:abstractNumId w:val="111100"/>
   </w:num>
   <w:num w:numId="18">
-    <w:abstractNumId w:val="2747710"/>
+    <w:abstractNumId w:val="111101"/>
   </w:num>
   <w:num w:numId="19">
-    <w:abstractNumId w:val="2747711"/>
+    <w:abstractNumId w:val="111102"/>
   </w:num>
   <w:num w:numId="20">
-    <w:abstractNumId w:val="2747712"/>
+    <w:abstractNumId w:val="111103"/>
   </w:num>
   <w:num w:numId="21">
-    <w:abstractNumId w:val="2747713"/>
+    <w:abstractNumId w:val="111104"/>
   </w:num>
   <w:num w:numId="22">
-    <w:abstractNumId w:val="2747714"/>
+    <w:abstractNumId w:val="111105"/>
   </w:num>
   <w:num w:numId="23">
-    <w:abstractNumId w:val="2747715"/>
+    <w:abstractNumId w:val="111106"/>
   </w:num>
   <w:num w:numId="24">
-    <w:abstractNumId w:val="2747716"/>
+    <w:abstractNumId w:val="111107"/>
   </w:num>
   <w:num w:numId="25">
-    <w:abstractNumId w:val="2747717"/>
+    <w:abstractNumId w:val="111108"/>
   </w:num>
   <w:num w:numId="26">
-    <w:abstractNumId w:val="2747718"/>
+    <w:abstractNumId w:val="111109"/>
   </w:num>
   <w:num w:numId="27">
-    <w:abstractNumId w:val="2747719"/>
+    <w:abstractNumId w:val="111110"/>
   </w:num>
   <w:num w:numId="28">
-    <w:abstractNumId w:val="2747720"/>
+    <w:abstractNumId w:val="111111"/>
   </w:num>
   <w:num w:numId="29">
-    <w:abstractNumId w:val="2747721"/>
+    <w:abstractNumId w:val="111112"/>
   </w:num>
   <w:num w:numId="30">
-    <w:abstractNumId w:val="2747722"/>
+    <w:abstractNumId w:val="111113"/>
   </w:num>
   <w:num w:numId="31">
-    <w:abstractNumId w:val="2747723"/>
+    <w:abstractNumId w:val="111114"/>
   </w:num>
   <w:num w:numId="32">
-    <w:abstractNumId w:val="2747724"/>
+    <w:abstractNumId w:val="111115"/>
   </w:num>
   <w:num w:numId="33">
-    <w:abstractNumId w:val="2747725"/>
+    <w:abstractNumId w:val="111116"/>
   </w:num>
   <w:num w:numId="34">
-    <w:abstractNumId w:val="2747726"/>
+    <w:abstractNumId w:val="111117"/>
   </w:num>
   <w:num w:numId="35">
-    <w:abstractNumId w:val="2747727"/>
+    <w:abstractNumId w:val="111118"/>
   </w:num>
   <w:num w:numId="36">
-    <w:abstractNumId w:val="2747728"/>
+    <w:abstractNumId w:val="111119"/>
   </w:num>
   <w:num w:numId="37">
-    <w:abstractNumId w:val="2747729"/>
+    <w:abstractNumId w:val="111120"/>
   </w:num>
   <w:num w:numId="38">
-    <w:abstractNumId w:val="2747730"/>
+    <w:abstractNumId w:val="111121"/>
   </w:num>
   <w:num w:numId="39">
-    <w:abstractNumId w:val="2747731"/>
+    <w:abstractNumId w:val="111122"/>
   </w:num>
   <w:num w:numId="40">
-    <w:abstractNumId w:val="2747732"/>
+    <w:abstractNumId w:val="111123"/>
   </w:num>
   <w:num w:numId="41">
-    <w:abstractNumId w:val="2747733"/>
+    <w:abstractNumId w:val="111124"/>
   </w:num>
   <w:num w:numId="42">
-    <w:abstractNumId w:val="2747734"/>
+    <w:abstractNumId w:val="111125"/>
   </w:num>
   <w:num w:numId="43">
-    <w:abstractNumId w:val="2747735"/>
+    <w:abstractNumId w:val="111126"/>
   </w:num>
   <w:num w:numId="44">
-    <w:abstractNumId w:val="2747736"/>
+    <w:abstractNumId w:val="111127"/>
   </w:num>
   <w:num w:numId="45">
-    <w:abstractNumId w:val="2747737"/>
+    <w:abstractNumId w:val="111128"/>
   </w:num>
   <w:num w:numId="46">
-    <w:abstractNumId w:val="2747738"/>
+    <w:abstractNumId w:val="111129"/>
   </w:num>
   <w:num w:numId="47">
-    <w:abstractNumId w:val="2747739"/>
+    <w:abstractNumId w:val="111130"/>
   </w:num>
   <w:num w:numId="48">
-    <w:abstractNumId w:val="2747740"/>
+    <w:abstractNumId w:val="111131"/>
   </w:num>
   <w:num w:numId="49">
-    <w:abstractNumId w:val="2747741"/>
+    <w:abstractNumId w:val="111132"/>
   </w:num>
   <w:num w:numId="50">
-    <w:abstractNumId w:val="2747742"/>
+    <w:abstractNumId w:val="111133"/>
   </w:num>
   <w:num w:numId="51">
-    <w:abstractNumId w:val="2747743"/>
+    <w:abstractNumId w:val="111134"/>
   </w:num>
   <w:num w:numId="52">
-    <w:abstractNumId w:val="2747744"/>
+    <w:abstractNumId w:val="111135"/>
   </w:num>
   <w:num w:numId="53">
-    <w:abstractNumId w:val="2747745"/>
+    <w:abstractNumId w:val="111136"/>
   </w:num>
   <w:num w:numId="54">
-    <w:abstractNumId w:val="2747746"/>
+    <w:abstractNumId w:val="111137"/>
   </w:num>
   <w:num w:numId="55">
-    <w:abstractNumId w:val="2747747"/>
+    <w:abstractNumId w:val="111138"/>
   </w:num>
   <w:num w:numId="56">
-    <w:abstractNumId w:val="2747748"/>
+    <w:abstractNumId w:val="111139"/>
   </w:num>
   <w:num w:numId="57">
-    <w:abstractNumId w:val="2747749"/>
+    <w:abstractNumId w:val="111140"/>
   </w:num>
   <w:num w:numId="58">
-    <w:abstractNumId w:val="2747750"/>
+    <w:abstractNumId w:val="111141"/>
   </w:num>
   <w:num w:numId="59">
-    <w:abstractNumId w:val="2747751"/>
+    <w:abstractNumId w:val="111142"/>
   </w:num>
   <w:num w:numId="60">
-    <w:abstractNumId w:val="2747752"/>
+    <w:abstractNumId w:val="111143"/>
   </w:num>
   <w:num w:numId="61">
-    <w:abstractNumId w:val="2747753"/>
+    <w:abstractNumId w:val="111144"/>
   </w:num>
   <w:num w:numId="62">
-    <w:abstractNumId w:val="2747754"/>
+    <w:abstractNumId w:val="111145"/>
   </w:num>
   <w:num w:numId="63">
-    <w:abstractNumId w:val="2747755"/>
+    <w:abstractNumId w:val="111146"/>
   </w:num>
   <w:num w:numId="64">
-    <w:abstractNumId w:val="2747756"/>
+    <w:abstractNumId w:val="111147"/>
   </w:num>
   <w:num w:numId="65">
-    <w:abstractNumId w:val="2747757"/>
+    <w:abstractNumId w:val="111148"/>
   </w:num>
   <w:num w:numId="66">
-    <w:abstractNumId w:val="2747758"/>
+    <w:abstractNumId w:val="111149"/>
   </w:num>
   <w:num w:numId="67">
-    <w:abstractNumId w:val="2747759"/>
+    <w:abstractNumId w:val="111150"/>
   </w:num>
   <w:num w:numId="68">
-    <w:abstractNumId w:val="2747760"/>
+    <w:abstractNumId w:val="111151"/>
   </w:num>
   <w:num w:numId="69">
-    <w:abstractNumId w:val="2747761"/>
+    <w:abstractNumId w:val="111152"/>
   </w:num>
   <w:num w:numId="70">
-    <w:abstractNumId w:val="2747762"/>
+    <w:abstractNumId w:val="111153"/>
   </w:num>
   <w:num w:numId="71">
-    <w:abstractNumId w:val="2747763"/>
+    <w:abstractNumId w:val="111154"/>
   </w:num>
   <w:num w:numId="72">
-    <w:abstractNumId w:val="2747764"/>
+    <w:abstractNumId w:val="111155"/>
   </w:num>
   <w:num w:numId="73">
-    <w:abstractNumId w:val="2747765"/>
+    <w:abstractNumId w:val="111156"/>
   </w:num>
   <w:num w:numId="74">
-    <w:abstractNumId w:val="2747766"/>
+    <w:abstractNumId w:val="111157"/>
   </w:num>
   <w:num w:numId="75">
-    <w:abstractNumId w:val="2747767"/>
+    <w:abstractNumId w:val="111158"/>
   </w:num>
   <w:num w:numId="76">
-    <w:abstractNumId w:val="2747768"/>
+    <w:abstractNumId w:val="111159"/>
   </w:num>
   <w:num w:numId="77">
-    <w:abstractNumId w:val="2747769"/>
+    <w:abstractNumId w:val="111160"/>
   </w:num>
   <w:num w:numId="78">
-    <w:abstractNumId w:val="2747770"/>
+    <w:abstractNumId w:val="111161"/>
   </w:num>
   <w:num w:numId="79">
-    <w:abstractNumId w:val="2747771"/>
+    <w:abstractNumId w:val="111162"/>
   </w:num>
   <w:num w:numId="80">
-    <w:abstractNumId w:val="2747772"/>
+    <w:abstractNumId w:val="111163"/>
   </w:num>
   <w:num w:numId="81">
-    <w:abstractNumId w:val="2747773"/>
+    <w:abstractNumId w:val="111164"/>
   </w:num>
   <w:num w:numId="82">
-    <w:abstractNumId w:val="2747774"/>
+    <w:abstractNumId w:val="111165"/>
   </w:num>
   <w:num w:numId="83">
-    <w:abstractNumId w:val="2747775"/>
+    <w:abstractNumId w:val="111166"/>
   </w:num>
   <w:num w:numId="84">
-    <w:abstractNumId w:val="2747776"/>
+    <w:abstractNumId w:val="111167"/>
   </w:num>
   <w:num w:numId="85">
-    <w:abstractNumId w:val="2747777"/>
+    <w:abstractNumId w:val="111168"/>
   </w:num>
   <w:num w:numId="86">
-    <w:abstractNumId w:val="2747778"/>
+    <w:abstractNumId w:val="111169"/>
   </w:num>
   <w:num w:numId="87">
-    <w:abstractNumId w:val="2747779"/>
+    <w:abstractNumId w:val="111170"/>
   </w:num>
   <w:num w:numId="88">
-    <w:abstractNumId w:val="2747780"/>
+    <w:abstractNumId w:val="111171"/>
   </w:num>
   <w:num w:numId="89">
-    <w:abstractNumId w:val="2747781"/>
+    <w:abstractNumId w:val="111172"/>
   </w:num>
   <w:num w:numId="90">
-    <w:abstractNumId w:val="2747782"/>
+    <w:abstractNumId w:val="111173"/>
   </w:num>
   <w:num w:numId="91">
-    <w:abstractNumId w:val="2747783"/>
+    <w:abstractNumId w:val="111174"/>
   </w:num>
   <w:num w:numId="92">
-    <w:abstractNumId w:val="2747784"/>
+    <w:abstractNumId w:val="111175"/>
   </w:num>
   <w:num w:numId="93">
-    <w:abstractNumId w:val="2747785"/>
+    <w:abstractNumId w:val="111176"/>
   </w:num>
   <w:num w:numId="94">
-    <w:abstractNumId w:val="2747786"/>
+    <w:abstractNumId w:val="111177"/>
   </w:num>
   <w:num w:numId="95">
-    <w:abstractNumId w:val="2747787"/>
+    <w:abstractNumId w:val="111178"/>
   </w:num>
   <w:num w:numId="96">
-    <w:abstractNumId w:val="2747788"/>
+    <w:abstractNumId w:val="111179"/>
   </w:num>
   <w:num w:numId="97">
-    <w:abstractNumId w:val="2747789"/>
+    <w:abstractNumId w:val="111180"/>
   </w:num>
   <w:num w:numId="98">
-    <w:abstractNumId w:val="2747790"/>
+    <w:abstractNumId w:val="111181"/>
   </w:num>
   <w:num w:numId="99">
-    <w:abstractNumId w:val="2747791"/>
+    <w:abstractNumId w:val="111182"/>
   </w:num>
   <w:num w:numId="100">
-    <w:abstractNumId w:val="2747792"/>
+    <w:abstractNumId w:val="111183"/>
   </w:num>
   <w:num w:numId="101">
-    <w:abstractNumId w:val="2747793"/>
+    <w:abstractNumId w:val="111184"/>
   </w:num>
   <w:num w:numId="102">
-    <w:abstractNumId w:val="2747794"/>
+    <w:abstractNumId w:val="111185"/>
   </w:num>
   <w:num w:numId="103">
-    <w:abstractNumId w:val="2747795"/>
+    <w:abstractNumId w:val="111186"/>
   </w:num>
   <w:num w:numId="104">
-    <w:abstractNumId w:val="2747796"/>
+    <w:abstractNumId w:val="111187"/>
   </w:num>
   <w:num w:numId="105">
-    <w:abstractNumId w:val="2747797"/>
+    <w:abstractNumId w:val="111188"/>
   </w:num>
   <w:num w:numId="106">
-    <w:abstractNumId w:val="2747798"/>
+    <w:abstractNumId w:val="111189"/>
   </w:num>
   <w:num w:numId="107">
-    <w:abstractNumId w:val="2747799"/>
+    <w:abstractNumId w:val="111190"/>
   </w:num>
   <w:num w:numId="108">
-    <w:abstractNumId w:val="2747800"/>
+    <w:abstractNumId w:val="111191"/>
   </w:num>
   <w:num w:numId="109">
-    <w:abstractNumId w:val="2747801"/>
+    <w:abstractNumId w:val="111192"/>
   </w:num>
   <w:num w:numId="110">
-    <w:abstractNumId w:val="2747802"/>
+    <w:abstractNumId w:val="111193"/>
   </w:num>
   <w:num w:numId="111">
-    <w:abstractNumId w:val="2747803"/>
+    <w:abstractNumId w:val="111194"/>
   </w:num>
   <w:num w:numId="112">
-    <w:abstractNumId w:val="2747804"/>
+    <w:abstractNumId w:val="111195"/>
   </w:num>
   <w:num w:numId="113">
-    <w:abstractNumId w:val="2747805"/>
+    <w:abstractNumId w:val="111196"/>
   </w:num>
   <w:num w:numId="114">
-    <w:abstractNumId w:val="2747806"/>
+    <w:abstractNumId w:val="111197"/>
   </w:num>
   <w:num w:numId="115">
-    <w:abstractNumId w:val="2747807"/>
+    <w:abstractNumId w:val="111198"/>
   </w:num>
   <w:num w:numId="116">
-    <w:abstractNumId w:val="2747808"/>
+    <w:abstractNumId w:val="111199"/>
   </w:num>
   <w:num w:numId="117">
-    <w:abstractNumId w:val="2747809"/>
+    <w:abstractNumId w:val="111200"/>
   </w:num>
   <w:num w:numId="118">
-    <w:abstractNumId w:val="2747810"/>
+    <w:abstractNumId w:val="111201"/>
   </w:num>
   <w:num w:numId="119">
-    <w:abstractNumId w:val="2747811"/>
+    <w:abstractNumId w:val="111202"/>
   </w:num>
   <w:num w:numId="120">
-    <w:abstractNumId w:val="2747812"/>
+    <w:abstractNumId w:val="111203"/>
   </w:num>
   <w:num w:numId="121">
-    <w:abstractNumId w:val="2747813"/>
+    <w:abstractNumId w:val="111204"/>
   </w:num>
   <w:num w:numId="122">
-    <w:abstractNumId w:val="2747814"/>
+    <w:abstractNumId w:val="111205"/>
   </w:num>
   <w:num w:numId="123">
-    <w:abstractNumId w:val="2747815"/>
+    <w:abstractNumId w:val="111206"/>
   </w:num>
   <w:num w:numId="124">
-    <w:abstractNumId w:val="2747816"/>
+    <w:abstractNumId w:val="111207"/>
   </w:num>
   <w:num w:numId="125">
-    <w:abstractNumId w:val="2747817"/>
+    <w:abstractNumId w:val="111208"/>
   </w:num>
   <w:num w:numId="126">
-    <w:abstractNumId w:val="2747818"/>
+    <w:abstractNumId w:val="111209"/>
   </w:num>
   <w:num w:numId="127">
-    <w:abstractNumId w:val="2747819"/>
+    <w:abstractNumId w:val="111210"/>
   </w:num>
   <w:num w:numId="128">
-    <w:abstractNumId w:val="2747820"/>
+    <w:abstractNumId w:val="111211"/>
   </w:num>
   <w:num w:numId="129">
-    <w:abstractNumId w:val="2747821"/>
+    <w:abstractNumId w:val="111212"/>
   </w:num>
   <w:num w:numId="130">
-    <w:abstractNumId w:val="2747822"/>
+    <w:abstractNumId w:val="111213"/>
   </w:num>
   <w:num w:numId="131">
-    <w:abstractNumId w:val="2747823"/>
+    <w:abstractNumId w:val="111214"/>
   </w:num>
   <w:num w:numId="132">
-    <w:abstractNumId w:val="2747824"/>
+    <w:abstractNumId w:val="111215"/>
   </w:num>
   <w:num w:numId="133">
-    <w:abstractNumId w:val="2747825"/>
+    <w:abstractNumId w:val="111216"/>
   </w:num>
   <w:num w:numId="134">
-    <w:abstractNumId w:val="2747826"/>
+    <w:abstractNumId w:val="111217"/>
   </w:num>
   <w:num w:numId="135">
-    <w:abstractNumId w:val="2747827"/>
+    <w:abstractNumId w:val="111218"/>
   </w:num>
   <w:num w:numId="136">
-    <w:abstractNumId w:val="2747828"/>
+    <w:abstractNumId w:val="111219"/>
   </w:num>
   <w:num w:numId="137">
-    <w:abstractNumId w:val="2747829"/>
+    <w:abstractNumId w:val="111220"/>
   </w:num>
   <w:num w:numId="138">
-    <w:abstractNumId w:val="2747830"/>
+    <w:abstractNumId w:val="111221"/>
   </w:num>
   <w:num w:numId="139">
-    <w:abstractNumId w:val="2747831"/>
+    <w:abstractNumId w:val="111222"/>
   </w:num>
   <w:num w:numId="140">
-    <w:abstractNumId w:val="2747832"/>
+    <w:abstractNumId w:val="111223"/>
   </w:num>
   <w:num w:numId="141">
-    <w:abstractNumId w:val="2747833"/>
+    <w:abstractNumId w:val="111224"/>
   </w:num>
   <w:num w:numId="142">
-    <w:abstractNumId w:val="2747834"/>
+    <w:abstractNumId w:val="111225"/>
   </w:num>
   <w:num w:numId="143">
-    <w:abstractNumId w:val="2747835"/>
+    <w:abstractNumId w:val="111226"/>
   </w:num>
   <w:num w:numId="144">
-    <w:abstractNumId w:val="2747836"/>
+    <w:abstractNumId w:val="111227"/>
   </w:num>
   <w:num w:numId="145">
-    <w:abstractNumId w:val="2747837"/>
+    <w:abstractNumId w:val="111228"/>
   </w:num>
   <w:num w:numId="146">
-    <w:abstractNumId w:val="2747838"/>
+    <w:abstractNumId w:val="111229"/>
   </w:num>
   <w:num w:numId="147">
-    <w:abstractNumId w:val="2747839"/>
+    <w:abstractNumId w:val="111230"/>
   </w:num>
   <w:num w:numId="148">
-    <w:abstractNumId w:val="2747840"/>
+    <w:abstractNumId w:val="111231"/>
   </w:num>
   <w:num w:numId="149">
-    <w:abstractNumId w:val="2747841"/>
+    <w:abstractNumId w:val="111232"/>
   </w:num>
   <w:num w:numId="150">
-    <w:abstractNumId w:val="2747842"/>
+    <w:abstractNumId w:val="111233"/>
   </w:num>
   <w:num w:numId="151">
-    <w:abstractNumId w:val="2747843"/>
+    <w:abstractNumId w:val="111234"/>
   </w:num>
   <w:num w:numId="152">
-    <w:abstractNumId w:val="2747844"/>
+    <w:abstractNumId w:val="111235"/>
   </w:num>
   <w:num w:numId="153">
-    <w:abstractNumId w:val="2747845"/>
+    <w:abstractNumId w:val="111236"/>
   </w:num>
   <w:num w:numId="154">
-    <w:abstractNumId w:val="2747846"/>
+    <w:abstractNumId w:val="111237"/>
   </w:num>
   <w:num w:numId="155">
-    <w:abstractNumId w:val="2747847"/>
+    <w:abstractNumId w:val="111238"/>
   </w:num>
   <w:num w:numId="156">
-    <w:abstractNumId w:val="2747848"/>
+    <w:abstractNumId w:val="111239"/>
   </w:num>
   <w:num w:numId="157">
-    <w:abstractNumId w:val="2747849"/>
+    <w:abstractNumId w:val="111240"/>
   </w:num>
   <w:num w:numId="158">
-    <w:abstractNumId w:val="2747850"/>
+    <w:abstractNumId w:val="111241"/>
   </w:num>
   <w:num w:numId="159">
-    <w:abstractNumId w:val="2747851"/>
+    <w:abstractNumId w:val="111242"/>
   </w:num>
   <w:num w:numId="160">
-    <w:abstractNumId w:val="2747852"/>
+    <w:abstractNumId w:val="111243"/>
   </w:num>
   <w:num w:numId="161">
-    <w:abstractNumId w:val="2747853"/>
+    <w:abstractNumId w:val="111244"/>
   </w:num>
   <w:num w:numId="162">
-    <w:abstractNumId w:val="2747854"/>
+    <w:abstractNumId w:val="111245"/>
   </w:num>
   <w:num w:numId="163">
-    <w:abstractNumId w:val="2747855"/>
+    <w:abstractNumId w:val="111246"/>
   </w:num>
   <w:num w:numId="164">
-    <w:abstractNumId w:val="2747856"/>
+    <w:abstractNumId w:val="111247"/>
   </w:num>
   <w:num w:numId="165">
-    <w:abstractNumId w:val="2747857"/>
+    <w:abstractNumId w:val="111248"/>
   </w:num>
   <w:num w:numId="166">
-    <w:abstractNumId w:val="2747858"/>
+    <w:abstractNumId w:val="111249"/>
   </w:num>
   <w:num w:numId="167">
-    <w:abstractNumId w:val="2747859"/>
+    <w:abstractNumId w:val="111250"/>
   </w:num>
   <w:num w:numId="168">
-    <w:abstractNumId w:val="2747860"/>
+    <w:abstractNumId w:val="111251"/>
   </w:num>
   <w:num w:numId="169">
-    <w:abstractNumId w:val="2747861"/>
+    <w:abstractNumId w:val="111252"/>
   </w:num>
   <w:num w:numId="170">
-    <w:abstractNumId w:val="2747862"/>
+    <w:abstractNumId w:val="111253"/>
   </w:num>
   <w:num w:numId="171">
-    <w:abstractNumId w:val="2747863"/>
+    <w:abstractNumId w:val="111254"/>
   </w:num>
   <w:num w:numId="172">
-    <w:abstractNumId w:val="2747864"/>
+    <w:abstractNumId w:val="111255"/>
   </w:num>
   <w:num w:numId="173">
-    <w:abstractNumId w:val="2747865"/>
+    <w:abstractNumId w:val="111256"/>
   </w:num>
   <w:num w:numId="174">
-    <w:abstractNumId w:val="2747866"/>
+    <w:abstractNumId w:val="111257"/>
   </w:num>
   <w:num w:numId="175">
-    <w:abstractNumId w:val="2747867"/>
+    <w:abstractNumId w:val="111258"/>
   </w:num>
   <w:num w:numId="176">
-    <w:abstractNumId w:val="2747868"/>
+    <w:abstractNumId w:val="111259"/>
   </w:num>
   <w:num w:numId="177">
-    <w:abstractNumId w:val="2747869"/>
+    <w:abstractNumId w:val="111260"/>
   </w:num>
   <w:num w:numId="178">
-    <w:abstractNumId w:val="2747870"/>
+    <w:abstractNumId w:val="111261"/>
   </w:num>
   <w:num w:numId="179">
-    <w:abstractNumId w:val="2747871"/>
+    <w:abstractNumId w:val="111262"/>
   </w:num>
   <w:num w:numId="180">
-    <w:abstractNumId w:val="2747872"/>
+    <w:abstractNumId w:val="111263"/>
   </w:num>
   <w:num w:numId="181">
-    <w:abstractNumId w:val="2747873"/>
+    <w:abstractNumId w:val="111264"/>
   </w:num>
   <w:num w:numId="182">
-    <w:abstractNumId w:val="2747874"/>
+    <w:abstractNumId w:val="111265"/>
   </w:num>
 </w:numbering>
 </file>

</xml_diff>